<commit_message>
Se agrega el campo de precio valido hasta para la proforma de separacion
</commit_message>
<xml_diff>
--- a/backend/app/templates/plantilla_separacion.docx
+++ b/backend/app/templates/plantilla_separacion.docx
@@ -1,12 +1,12 @@
 
 <file path=word/document.xml><?xml version="1.0" encoding="utf-8"?>
-<w:document xmlns:wpc="http://schemas.microsoft.com/office/word/2010/wordprocessingCanvas" xmlns:cx="http://schemas.microsoft.com/office/drawing/2014/chartex" xmlns:cx1="http://schemas.microsoft.com/office/drawing/2015/9/8/chartex" xmlns:cx2="http://schemas.microsoft.com/office/drawing/2015/10/21/chartex" xmlns:cx3="http://schemas.microsoft.com/office/drawing/2016/5/9/chartex" xmlns:cx4="http://schemas.microsoft.com/office/drawing/2016/5/10/chartex" xmlns:cx5="http://schemas.microsoft.com/office/drawing/2016/5/11/chartex" xmlns:cx6="http://schemas.microsoft.com/office/drawing/2016/5/12/chartex" xmlns:cx7="http://schemas.microsoft.com/office/drawing/2016/5/13/chartex" xmlns:cx8="http://schemas.microsoft.com/office/drawing/2016/5/14/chartex" xmlns:mc="http://schemas.openxmlformats.org/markup-compatibility/2006" xmlns:aink="http://schemas.microsoft.com/office/drawing/2016/ink" xmlns:am3d="http://schemas.microsoft.com/office/drawing/2017/model3d" xmlns:o="urn:schemas-microsoft-com:office:office" xmlns:oel="http://schemas.microsoft.com/office/2019/extlst" xmlns:r="http://schemas.openxmlformats.org/officeDocument/2006/relationships" xmlns:m="http://schemas.openxmlformats.org/officeDocument/2006/math" xmlns:v="urn:schemas-microsoft-com:vml" xmlns:wp14="http://schemas.microsoft.com/office/word/2010/wordprocessingDrawing" xmlns:wp="http://schemas.openxmlformats.org/drawingml/2006/wordprocessingDrawing" xmlns:w10="urn:schemas-microsoft-com:office:word" xmlns:w="http://schemas.openxmlformats.org/wordprocessingml/2006/main" xmlns:w14="http://schemas.microsoft.com/office/word/2010/wordml" xmlns:w15="http://schemas.microsoft.com/office/word/2012/wordml" xmlns:w16cex="http://schemas.microsoft.com/office/word/2018/wordml/cex" xmlns:w16cid="http://schemas.microsoft.com/office/word/2016/wordml/cid" xmlns:w16="http://schemas.microsoft.com/office/word/2018/wordml" xmlns:w16du="http://schemas.microsoft.com/office/word/2023/wordml/word16du" xmlns:w16sdtdh="http://schemas.microsoft.com/office/word/2020/wordml/sdtdatahash" xmlns:w16se="http://schemas.microsoft.com/office/word/2015/wordml/symex" xmlns:wpg="http://schemas.microsoft.com/office/word/2010/wordprocessingGroup" xmlns:wpi="http://schemas.microsoft.com/office/word/2010/wordprocessingInk" xmlns:wne="http://schemas.microsoft.com/office/word/2006/wordml" xmlns:wps="http://schemas.microsoft.com/office/word/2010/wordprocessingShape" mc:Ignorable="w14 w15 w16se w16cid w16 w16cex w16sdtdh w16du wp14">
+<w:document xmlns:wpc="http://schemas.microsoft.com/office/word/2010/wordprocessingCanvas" xmlns:cx="http://schemas.microsoft.com/office/drawing/2014/chartex" xmlns:cx1="http://schemas.microsoft.com/office/drawing/2015/9/8/chartex" xmlns:cx2="http://schemas.microsoft.com/office/drawing/2015/10/21/chartex" xmlns:cx3="http://schemas.microsoft.com/office/drawing/2016/5/9/chartex" xmlns:cx4="http://schemas.microsoft.com/office/drawing/2016/5/10/chartex" xmlns:cx5="http://schemas.microsoft.com/office/drawing/2016/5/11/chartex" xmlns:cx6="http://schemas.microsoft.com/office/drawing/2016/5/12/chartex" xmlns:cx7="http://schemas.microsoft.com/office/drawing/2016/5/13/chartex" xmlns:cx8="http://schemas.microsoft.com/office/drawing/2016/5/14/chartex" xmlns:mc="http://schemas.openxmlformats.org/markup-compatibility/2006" xmlns:aink="http://schemas.microsoft.com/office/drawing/2016/ink" xmlns:am3d="http://schemas.microsoft.com/office/drawing/2017/model3d" xmlns:o="urn:schemas-microsoft-com:office:office" xmlns:oel="http://schemas.microsoft.com/office/2019/extlst" xmlns:r="http://schemas.openxmlformats.org/officeDocument/2006/relationships" xmlns:m="http://schemas.openxmlformats.org/officeDocument/2006/math" xmlns:v="urn:schemas-microsoft-com:vml" xmlns:wp14="http://schemas.microsoft.com/office/word/2010/wordprocessingDrawing" xmlns:wp="http://schemas.openxmlformats.org/drawingml/2006/wordprocessingDrawing" xmlns:w10="urn:schemas-microsoft-com:office:word" xmlns:w="http://schemas.openxmlformats.org/wordprocessingml/2006/main" xmlns:w14="http://schemas.microsoft.com/office/word/2010/wordml" xmlns:w15="http://schemas.microsoft.com/office/word/2012/wordml" xmlns:w16cex="http://schemas.microsoft.com/office/word/2018/wordml/cex" xmlns:w16cid="http://schemas.microsoft.com/office/word/2016/wordml/cid" xmlns:w16="http://schemas.microsoft.com/office/word/2018/wordml" xmlns:w16du="http://schemas.microsoft.com/office/word/2023/wordml/word16du" xmlns:w16sdtdh="http://schemas.microsoft.com/office/word/2020/wordml/sdtdatahash" xmlns:w16sdtfl="http://schemas.microsoft.com/office/word/2024/wordml/sdtformatlock" xmlns:w16se="http://schemas.microsoft.com/office/word/2015/wordml/symex" xmlns:wpg="http://schemas.microsoft.com/office/word/2010/wordprocessingGroup" xmlns:wpi="http://schemas.microsoft.com/office/word/2010/wordprocessingInk" xmlns:wne="http://schemas.microsoft.com/office/word/2006/wordml" xmlns:wps="http://schemas.microsoft.com/office/word/2010/wordprocessingShape" mc:Ignorable="w14 w15 w16se w16cid w16 w16cex w16sdtdh w16sdtfl w16du wp14">
   <w:body>
     <w:tbl>
       <w:tblPr>
         <w:tblStyle w:val="TableNormal"/>
-        <w:tblW w:w="0" w:type="auto"/>
-        <w:tblInd w:w="129" w:type="dxa"/>
+        <w:tblW w:w="10065" w:type="dxa"/>
+        <w:tblInd w:w="-279" w:type="dxa"/>
         <w:tblBorders>
           <w:top w:val="single" w:sz="4" w:space="0" w:color="000000"/>
           <w:left w:val="single" w:sz="4" w:space="0" w:color="000000"/>
@@ -19,10 +19,10 @@
         <w:tblLook w:val="01E0" w:firstRow="1" w:lastRow="1" w:firstColumn="1" w:lastColumn="1" w:noHBand="0" w:noVBand="0"/>
       </w:tblPr>
       <w:tblGrid>
-        <w:gridCol w:w="2268"/>
+        <w:gridCol w:w="2676"/>
         <w:gridCol w:w="2072"/>
         <w:gridCol w:w="1616"/>
-        <w:gridCol w:w="3486"/>
+        <w:gridCol w:w="3701"/>
       </w:tblGrid>
       <w:tr>
         <w:trPr>
@@ -30,18 +30,12 @@
         </w:trPr>
         <w:tc>
           <w:tcPr>
-            <w:tcW w:w="9442" w:type="dxa"/>
+            <w:tcW w:w="10065" w:type="dxa"/>
             <w:gridSpan w:val="4"/>
           </w:tcPr>
           <w:p>
             <w:pPr>
-              <w:pStyle w:val="TableParagraph"/>
-              <w:spacing w:before="27"/>
-              <w:ind w:left="0"/>
-              <w:rPr>
-                <w:rFonts w:ascii="Times New Roman"/>
-                <w:sz w:val="25"/>
-              </w:rPr>
+              <w:pStyle w:val="Prrafodelista"/>
             </w:pPr>
           </w:p>
           <w:p>
@@ -87,7 +81,7 @@
               <mc:AlternateContent>
                 <mc:Choice Requires="wpg">
                   <w:drawing>
-                    <wp:anchor distT="0" distB="0" distL="0" distR="0" simplePos="0" relativeHeight="487522816" behindDoc="1" locked="0" layoutInCell="1" allowOverlap="1" wp14:anchorId="6D3ED61D" wp14:editId="1EA8FA6B">
+                    <wp:anchor distT="0" distB="0" distL="0" distR="0" simplePos="0" relativeHeight="251658752" behindDoc="1" locked="0" layoutInCell="1" allowOverlap="1" wp14:anchorId="6D3ED61D" wp14:editId="1EA8FA6B">
                       <wp:simplePos x="0" y="0"/>
                       <wp:positionH relativeFrom="column">
                         <wp:posOffset>155143</wp:posOffset>
@@ -145,7 +139,7 @@
                 </mc:Choice>
                 <mc:Fallback>
                   <w:pict>
-                    <v:group w14:anchorId="32805C6F" id="Group 4" o:spid="_x0000_s1026" style="position:absolute;margin-left:12.2pt;margin-top:-20.85pt;width:78.65pt;height:42.75pt;z-index:-15793664;mso-wrap-distance-left:0;mso-wrap-distance-right:0" coordsize="9988,5429" o:gfxdata="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">
+                    <v:group w14:anchorId="10D05CA2" id="Group 4" o:spid="_x0000_s1026" style="position:absolute;margin-left:12.2pt;margin-top:-20.85pt;width:78.65pt;height:42.75pt;z-index:-251657728;mso-wrap-distance-left:0;mso-wrap-distance-right:0" coordsize="9988,5429" o:gfxdata="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">
                       <v:shapetype id="_x0000_t75" coordsize="21600,21600" o:spt="75" o:preferrelative="t" path="m@4@5l@4@11@9@11@9@5xe" filled="f" stroked="f">
                         <v:stroke joinstyle="miter"/>
                         <v:formulas>
@@ -207,6 +201,7 @@
               </w:rPr>
               <w:t xml:space="preserve"> </w:t>
             </w:r>
+            <w:proofErr w:type="spellStart"/>
             <w:r>
               <w:rPr>
                 <w:rFonts w:ascii="Arial" w:hAnsi="Arial"/>
@@ -215,6 +210,7 @@
               </w:rPr>
               <w:t>N°</w:t>
             </w:r>
+            <w:proofErr w:type="spellEnd"/>
             <w:r>
               <w:rPr>
                 <w:rFonts w:ascii="Arial" w:hAnsi="Arial"/>
@@ -242,7 +238,7 @@
         </w:trPr>
         <w:tc>
           <w:tcPr>
-            <w:tcW w:w="9442" w:type="dxa"/>
+            <w:tcW w:w="10065" w:type="dxa"/>
             <w:gridSpan w:val="4"/>
           </w:tcPr>
           <w:p>
@@ -284,7 +280,16 @@
                 <w:b/>
                 <w:sz w:val="24"/>
               </w:rPr>
-              <w:t>Separación:</w:t>
+              <w:t>Separación</w:t>
+            </w:r>
+            <w:proofErr w:type="gramStart"/>
+            <w:r>
+              <w:rPr>
+                <w:rFonts w:ascii="Arial" w:hAnsi="Arial"/>
+                <w:b/>
+                <w:sz w:val="24"/>
+              </w:rPr>
+              <w:t>:</w:t>
             </w:r>
             <w:r>
               <w:rPr>
@@ -301,53 +306,16 @@
                 <w:b/>
                 <w:sz w:val="24"/>
               </w:rPr>
-              <w:t>{{FECHA}}</w:t>
-            </w:r>
-            <w:r>
-              <w:rPr>
-                <w:rFonts w:ascii="Arial" w:hAnsi="Arial"/>
-                <w:b/>
-                <w:spacing w:val="1"/>
+              <w:t>{</w:t>
+            </w:r>
+            <w:proofErr w:type="gramEnd"/>
+            <w:r>
+              <w:rPr>
+                <w:rFonts w:ascii="Arial" w:hAnsi="Arial"/>
+                <w:b/>
                 <w:sz w:val="24"/>
               </w:rPr>
-            </w:r>
-            <w:r>
-              <w:rPr>
-                <w:rFonts w:ascii="Arial" w:hAnsi="Arial"/>
-                <w:b/>
-                <w:sz w:val="24"/>
-              </w:rPr>
-            </w:r>
-            <w:r>
-              <w:rPr>
-                <w:rFonts w:ascii="Arial" w:hAnsi="Arial"/>
-                <w:b/>
-                <w:spacing w:val="62"/>
-                <w:sz w:val="24"/>
-              </w:rPr>
-            </w:r>
-            <w:r>
-              <w:rPr>
-                <w:rFonts w:ascii="Arial" w:hAnsi="Arial"/>
-                <w:b/>
-                <w:sz w:val="24"/>
-              </w:rPr>
-            </w:r>
-            <w:r>
-              <w:rPr>
-                <w:rFonts w:ascii="Arial" w:hAnsi="Arial"/>
-                <w:b/>
-                <w:spacing w:val="62"/>
-                <w:sz w:val="24"/>
-              </w:rPr>
-            </w:r>
-            <w:r>
-              <w:rPr>
-                <w:rFonts w:ascii="Arial" w:hAnsi="Arial"/>
-                <w:b/>
-                <w:spacing w:val="-4"/>
-                <w:sz w:val="24"/>
-              </w:rPr>
+              <w:t>{FECHA}}</w:t>
             </w:r>
             <w:r>
               <w:rPr>
@@ -413,22 +381,6 @@
               </w:rPr>
               <w:tab/>
               <w:t>{{IMPORTE}}</w:t>
-            </w:r>
-            <w:r>
-              <w:rPr>
-                <w:rFonts w:ascii="Arial" w:hAnsi="Arial"/>
-                <w:b/>
-                <w:spacing w:val="-3"/>
-                <w:sz w:val="21"/>
-              </w:rPr>
-            </w:r>
-            <w:r>
-              <w:rPr>
-                <w:rFonts w:ascii="Arial" w:hAnsi="Arial"/>
-                <w:b/>
-                <w:spacing w:val="-5"/>
-                <w:sz w:val="21"/>
-              </w:rPr>
             </w:r>
           </w:p>
         </w:tc>
@@ -439,7 +391,7 @@
         </w:trPr>
         <w:tc>
           <w:tcPr>
-            <w:tcW w:w="5956" w:type="dxa"/>
+            <w:tcW w:w="6364" w:type="dxa"/>
             <w:gridSpan w:val="3"/>
           </w:tcPr>
           <w:p>
@@ -516,27 +468,11 @@
               </w:rPr>
               <w:t>{{FORMA_PAGO}}</w:t>
             </w:r>
-            <w:r>
-              <w:rPr>
-                <w:rFonts w:ascii="Arial"/>
-                <w:b/>
-                <w:spacing w:val="-10"/>
-                <w:sz w:val="20"/>
-              </w:rPr>
-            </w:r>
-            <w:r>
-              <w:rPr>
-                <w:rFonts w:ascii="Arial"/>
-                <w:b/>
-                <w:spacing w:val="-2"/>
-                <w:sz w:val="20"/>
-              </w:rPr>
-            </w:r>
           </w:p>
         </w:tc>
         <w:tc>
           <w:tcPr>
-            <w:tcW w:w="3486" w:type="dxa"/>
+            <w:tcW w:w="3701" w:type="dxa"/>
           </w:tcPr>
           <w:p>
             <w:pPr>
@@ -549,6 +485,7 @@
                 <w:sz w:val="18"/>
               </w:rPr>
             </w:pPr>
+            <w:proofErr w:type="spellStart"/>
             <w:r>
               <w:rPr>
                 <w:rFonts w:ascii="Arial" w:hAnsi="Arial"/>
@@ -557,6 +494,7 @@
               </w:rPr>
               <w:t>Voucher</w:t>
             </w:r>
+            <w:proofErr w:type="spellEnd"/>
             <w:r>
               <w:rPr>
                 <w:rFonts w:ascii="Arial" w:hAnsi="Arial"/>
@@ -566,13 +504,23 @@
               </w:rPr>
               <w:t xml:space="preserve"> </w:t>
             </w:r>
+            <w:proofErr w:type="spellStart"/>
             <w:r>
               <w:rPr>
                 <w:rFonts w:ascii="Arial" w:hAnsi="Arial"/>
                 <w:b/>
                 <w:sz w:val="18"/>
               </w:rPr>
-              <w:t>N°:</w:t>
+              <w:t>N°</w:t>
+            </w:r>
+            <w:proofErr w:type="spellEnd"/>
+            <w:r>
+              <w:rPr>
+                <w:rFonts w:ascii="Arial" w:hAnsi="Arial"/>
+                <w:b/>
+                <w:sz w:val="18"/>
+              </w:rPr>
+              <w:t>:</w:t>
             </w:r>
             <w:r>
               <w:rPr>
@@ -597,11 +545,11 @@
       </w:tr>
       <w:tr>
         <w:trPr>
-          <w:trHeight w:val="2121"/>
+          <w:trHeight w:val="1871"/>
         </w:trPr>
         <w:tc>
           <w:tcPr>
-            <w:tcW w:w="9442" w:type="dxa"/>
+            <w:tcW w:w="10065" w:type="dxa"/>
             <w:gridSpan w:val="4"/>
           </w:tcPr>
           <w:p>
@@ -634,8 +582,9 @@
                 <w:sz w:val="19"/>
                 <w:u w:val="single"/>
               </w:rPr>
-              <w:t xml:space="preserve"> {{CLIENTE}}</w:t>
-            </w:r>
+              <w:t xml:space="preserve"> {{CLIENTE</w:t>
+            </w:r>
+            <w:proofErr w:type="gramStart"/>
             <w:r>
               <w:rPr>
                 <w:rFonts w:ascii="Arial"/>
@@ -643,20 +592,64 @@
                 <w:sz w:val="19"/>
                 <w:u w:val="single"/>
               </w:rPr>
-              <w:tab/>
+              <w:t>}}</w:t>
             </w:r>
             <w:r>
               <w:rPr>
                 <w:rFonts w:ascii="Arial"/>
                 <w:b/>
                 <w:sz w:val="19"/>
-              </w:rPr>
-              <w:t xml:space="preserve"> DNI:</w:t>
-            </w:r>
+                <w:u w:val="single"/>
+              </w:rPr>
+              <w:t xml:space="preserve">   </w:t>
+            </w:r>
+            <w:proofErr w:type="gramEnd"/>
             <w:r>
               <w:rPr>
                 <w:rFonts w:ascii="Arial"/>
                 <w:b/>
+                <w:sz w:val="19"/>
+                <w:u w:val="single"/>
+              </w:rPr>
+              <w:t xml:space="preserve">                                            </w:t>
+            </w:r>
+            <w:r>
+              <w:rPr>
+                <w:rFonts w:ascii="Arial"/>
+                <w:b/>
+                <w:sz w:val="19"/>
+              </w:rPr>
+              <w:t xml:space="preserve"> </w:t>
+            </w:r>
+            <w:r>
+              <w:rPr>
+                <w:rFonts w:ascii="Arial"/>
+                <w:b/>
+                <w:sz w:val="19"/>
+              </w:rPr>
+              <w:t xml:space="preserve">     </w:t>
+            </w:r>
+            <w:r>
+              <w:rPr>
+                <w:rFonts w:ascii="Arial"/>
+                <w:b/>
+                <w:sz w:val="19"/>
+              </w:rPr>
+              <w:t>DNI</w:t>
+            </w:r>
+            <w:proofErr w:type="gramStart"/>
+            <w:r>
+              <w:rPr>
+                <w:rFonts w:ascii="Arial"/>
+                <w:b/>
+                <w:sz w:val="19"/>
+              </w:rPr>
+              <w:t>:</w:t>
+            </w:r>
+            <w:r>
+              <w:rPr>
+                <w:rFonts w:ascii="Arial"/>
+                <w:b/>
                 <w:spacing w:val="-4"/>
                 <w:sz w:val="19"/>
               </w:rPr>
@@ -680,7 +673,18 @@
                 <w:sz w:val="19"/>
                 <w:u w:val="single"/>
               </w:rPr>
-              <w:t>{{DNI}}</w:t>
+              <w:t>{</w:t>
+            </w:r>
+            <w:proofErr w:type="gramEnd"/>
+            <w:r>
+              <w:rPr>
+                <w:rFonts w:ascii="Arial"/>
+                <w:b/>
+                <w:spacing w:val="-2"/>
+                <w:sz w:val="19"/>
+                <w:u w:val="single"/>
+              </w:rPr>
+              <w:t>{DNI}}</w:t>
             </w:r>
             <w:r>
               <w:rPr>
@@ -705,7 +709,10 @@
               <w:ind w:left="86" w:right="-58"/>
               <w:jc w:val="both"/>
               <w:rPr>
-                <w:sz w:val="19"/>
+                <w:rFonts w:ascii="Arial" w:hAnsi="Arial"/>
+                <w:b/>
+                <w:sz w:val="19"/>
+                <w:u w:val="single"/>
               </w:rPr>
             </w:pPr>
             <w:r>
@@ -714,7 +721,16 @@
                 <w:b/>
                 <w:sz w:val="19"/>
               </w:rPr>
-              <w:t xml:space="preserve">Dirección: </w:t>
+              <w:t>Dirección</w:t>
+            </w:r>
+            <w:proofErr w:type="gramStart"/>
+            <w:r>
+              <w:rPr>
+                <w:rFonts w:ascii="Arial" w:hAnsi="Arial"/>
+                <w:b/>
+                <w:sz w:val="19"/>
+              </w:rPr>
+              <w:t xml:space="preserve">: </w:t>
             </w:r>
             <w:r>
               <w:rPr>
@@ -723,7 +739,90 @@
                 <w:sz w:val="19"/>
                 <w:u w:val="single"/>
               </w:rPr>
-              <w:t xml:space="preserve"> {{DIRECCION}}</w:t>
+              <w:t xml:space="preserve"> {</w:t>
+            </w:r>
+            <w:proofErr w:type="gramEnd"/>
+            <w:r>
+              <w:rPr>
+                <w:rFonts w:ascii="Arial" w:hAnsi="Arial"/>
+                <w:b/>
+                <w:sz w:val="19"/>
+                <w:u w:val="single"/>
+              </w:rPr>
+              <w:t>{DIRECCION</w:t>
+            </w:r>
+            <w:proofErr w:type="gramStart"/>
+            <w:r>
+              <w:rPr>
+                <w:rFonts w:ascii="Arial" w:hAnsi="Arial"/>
+                <w:b/>
+                <w:sz w:val="19"/>
+                <w:u w:val="single"/>
+              </w:rPr>
+              <w:t>}}</w:t>
+            </w:r>
+            <w:r>
+              <w:rPr>
+                <w:rFonts w:ascii="Arial" w:hAnsi="Arial"/>
+                <w:b/>
+                <w:sz w:val="19"/>
+                <w:u w:val="single"/>
+              </w:rPr>
+              <w:t xml:space="preserve">   </w:t>
+            </w:r>
+            <w:proofErr w:type="gramEnd"/>
+            <w:r>
+              <w:rPr>
+                <w:rFonts w:ascii="Arial" w:hAnsi="Arial"/>
+                <w:b/>
+                <w:sz w:val="19"/>
+                <w:u w:val="single"/>
+              </w:rPr>
+              <w:t xml:space="preserve">                                        </w:t>
+            </w:r>
+            <w:r>
+              <w:rPr>
+                <w:rFonts w:ascii="Arial" w:hAnsi="Arial"/>
+                <w:b/>
+                <w:sz w:val="19"/>
+              </w:rPr>
+              <w:t>Email</w:t>
+            </w:r>
+            <w:proofErr w:type="gramStart"/>
+            <w:r>
+              <w:rPr>
+                <w:rFonts w:ascii="Arial" w:hAnsi="Arial"/>
+                <w:b/>
+                <w:sz w:val="19"/>
+              </w:rPr>
+              <w:t xml:space="preserve">: </w:t>
+            </w:r>
+            <w:r>
+              <w:rPr>
+                <w:rFonts w:ascii="Arial" w:hAnsi="Arial"/>
+                <w:b/>
+                <w:sz w:val="19"/>
+                <w:u w:val="single"/>
+              </w:rPr>
+              <w:t xml:space="preserve"> {</w:t>
+            </w:r>
+            <w:proofErr w:type="gramEnd"/>
+            <w:r>
+              <w:rPr>
+                <w:rFonts w:ascii="Arial" w:hAnsi="Arial"/>
+                <w:b/>
+                <w:sz w:val="19"/>
+                <w:u w:val="single"/>
+              </w:rPr>
+              <w:t>{EMAIL}}</w:t>
+            </w:r>
+            <w:r>
+              <w:rPr>
+                <w:rFonts w:ascii="Arial" w:hAnsi="Arial"/>
+                <w:b/>
+                <w:sz w:val="19"/>
+                <w:u w:val="single"/>
+              </w:rPr>
               <w:tab/>
             </w:r>
             <w:r>
@@ -733,6 +832,68 @@
                 <w:sz w:val="19"/>
                 <w:u w:val="single"/>
               </w:rPr>
+              <w:t xml:space="preserve">                                              </w:t>
+            </w:r>
+          </w:p>
+          <w:p>
+            <w:pPr>
+              <w:pStyle w:val="TableParagraph"/>
+              <w:tabs>
+                <w:tab w:val="left" w:pos="4398"/>
+                <w:tab w:val="left" w:pos="7011"/>
+                <w:tab w:val="left" w:pos="9435"/>
+                <w:tab w:val="left" w:pos="9482"/>
+              </w:tabs>
+              <w:spacing w:line="369" w:lineRule="auto"/>
+              <w:ind w:left="86" w:right="-58"/>
+              <w:jc w:val="both"/>
+              <w:rPr>
+                <w:sz w:val="19"/>
+              </w:rPr>
+            </w:pPr>
+            <w:r>
+              <w:rPr>
+                <w:rFonts w:ascii="Arial" w:hAnsi="Arial"/>
+                <w:b/>
+                <w:sz w:val="19"/>
+              </w:rPr>
+              <w:t>Celular 1</w:t>
+            </w:r>
+            <w:proofErr w:type="gramStart"/>
+            <w:r>
+              <w:rPr>
+                <w:rFonts w:ascii="Arial" w:hAnsi="Arial"/>
+                <w:b/>
+                <w:sz w:val="19"/>
+              </w:rPr>
+              <w:t xml:space="preserve">: </w:t>
+            </w:r>
+            <w:r>
+              <w:rPr>
+                <w:rFonts w:ascii="Arial" w:hAnsi="Arial"/>
+                <w:b/>
+                <w:sz w:val="19"/>
+                <w:u w:val="single"/>
+              </w:rPr>
+              <w:t xml:space="preserve"> {</w:t>
+            </w:r>
+            <w:proofErr w:type="gramEnd"/>
+            <w:r>
+              <w:rPr>
+                <w:rFonts w:ascii="Arial" w:hAnsi="Arial"/>
+                <w:b/>
+                <w:sz w:val="19"/>
+                <w:u w:val="single"/>
+              </w:rPr>
+              <w:t>{CELULAR1}}</w:t>
+            </w:r>
+            <w:r>
+              <w:rPr>
+                <w:rFonts w:ascii="Arial" w:hAnsi="Arial"/>
+                <w:b/>
+                <w:sz w:val="19"/>
+                <w:u w:val="single"/>
+              </w:rPr>
               <w:tab/>
             </w:r>
             <w:r>
@@ -740,8 +901,44 @@
                 <w:rFonts w:ascii="Arial" w:hAnsi="Arial"/>
                 <w:b/>
                 <w:sz w:val="19"/>
+              </w:rPr>
+              <w:t xml:space="preserve"> Celular 2</w:t>
+            </w:r>
+            <w:proofErr w:type="gramStart"/>
+            <w:r>
+              <w:rPr>
+                <w:rFonts w:ascii="Arial" w:hAnsi="Arial"/>
+                <w:b/>
+                <w:sz w:val="19"/>
+              </w:rPr>
+              <w:t xml:space="preserve">: </w:t>
+            </w:r>
+            <w:r>
+              <w:rPr>
+                <w:rFonts w:ascii="Arial" w:hAnsi="Arial"/>
+                <w:b/>
+                <w:sz w:val="19"/>
                 <w:u w:val="single"/>
               </w:rPr>
+              <w:t xml:space="preserve"> {</w:t>
+            </w:r>
+            <w:proofErr w:type="gramEnd"/>
+            <w:r>
+              <w:rPr>
+                <w:rFonts w:ascii="Arial" w:hAnsi="Arial"/>
+                <w:b/>
+                <w:sz w:val="19"/>
+                <w:u w:val="single"/>
+              </w:rPr>
+              <w:t>{CELULAR2}}</w:t>
+            </w:r>
+            <w:r>
+              <w:rPr>
+                <w:rFonts w:ascii="Arial" w:hAnsi="Arial"/>
+                <w:b/>
+                <w:sz w:val="19"/>
+                <w:u w:val="single"/>
+              </w:rPr>
               <w:tab/>
             </w:r>
             <w:r>
@@ -759,85 +956,31 @@
                 <w:b/>
                 <w:sz w:val="19"/>
               </w:rPr>
-              <w:t xml:space="preserve"> Email: </w:t>
-            </w:r>
-            <w:r>
-              <w:rPr>
-                <w:rFonts w:ascii="Arial" w:hAnsi="Arial"/>
-                <w:b/>
+              <w:t xml:space="preserve"> Importe de la separación</w:t>
+            </w:r>
+            <w:proofErr w:type="gramStart"/>
+            <w:r>
+              <w:rPr>
+                <w:rFonts w:ascii="Arial" w:hAnsi="Arial"/>
+                <w:b/>
+                <w:sz w:val="19"/>
+              </w:rPr>
+              <w:t xml:space="preserve">: </w:t>
+            </w:r>
+            <w:r>
+              <w:rPr>
                 <w:sz w:val="19"/>
                 <w:u w:val="single"/>
               </w:rPr>
-              <w:t xml:space="preserve"> {{EMAIL}}</w:t>
-              <w:tab/>
-            </w:r>
-            <w:r>
-              <w:rPr>
-                <w:rFonts w:ascii="Arial" w:hAnsi="Arial"/>
-                <w:b/>
-                <w:sz w:val="19"/>
-              </w:rPr>
-              <w:t xml:space="preserve">Celular 1: </w:t>
-            </w:r>
-            <w:r>
-              <w:rPr>
-                <w:rFonts w:ascii="Arial" w:hAnsi="Arial"/>
-                <w:b/>
+              <w:t xml:space="preserve"> {</w:t>
+            </w:r>
+            <w:proofErr w:type="gramEnd"/>
+            <w:r>
+              <w:rPr>
                 <w:sz w:val="19"/>
                 <w:u w:val="single"/>
               </w:rPr>
-              <w:t xml:space="preserve"> {{CELULAR1}}</w:t>
-            </w:r>
-            <w:r>
-              <w:rPr>
-                <w:rFonts w:ascii="Arial" w:hAnsi="Arial"/>
-                <w:b/>
-                <w:sz w:val="19"/>
-                <w:u w:val="single"/>
-              </w:rPr>
-              <w:tab/>
-            </w:r>
-            <w:r>
-              <w:rPr>
-                <w:rFonts w:ascii="Arial" w:hAnsi="Arial"/>
-                <w:b/>
-                <w:sz w:val="19"/>
-              </w:rPr>
-              <w:t xml:space="preserve"> Celular 2: </w:t>
-            </w:r>
-            <w:r>
-              <w:rPr>
-                <w:rFonts w:ascii="Arial" w:hAnsi="Arial"/>
-                <w:b/>
-                <w:sz w:val="19"/>
-                <w:u w:val="single"/>
-              </w:rPr>
-              <w:t xml:space="preserve"> {{CELULAR2}}</w:t>
-              <w:tab/>
-            </w:r>
-            <w:r>
-              <w:rPr>
-                <w:rFonts w:ascii="Arial" w:hAnsi="Arial"/>
-                <w:b/>
-                <w:sz w:val="19"/>
-                <w:u w:val="single"/>
-              </w:rPr>
-              <w:tab/>
-            </w:r>
-            <w:r>
-              <w:rPr>
-                <w:rFonts w:ascii="Arial" w:hAnsi="Arial"/>
-                <w:b/>
-                <w:sz w:val="19"/>
-              </w:rPr>
-              <w:t xml:space="preserve"> Importe de la separación: </w:t>
-            </w:r>
-            <w:r>
-              <w:rPr>
-                <w:sz w:val="19"/>
-                <w:u w:val="single"/>
-              </w:rPr>
-              <w:t xml:space="preserve"> {{IMPORTE_LETRAS}}</w:t>
+              <w:t>{IMPORTE_LETRAS}}</w:t>
             </w:r>
             <w:r>
               <w:rPr>
@@ -1008,72 +1151,6 @@
             </w:r>
             <w:r>
               <w:rPr>
-                <w:spacing w:val="-2"/>
-                <w:w w:val="99"/>
-                <w:sz w:val="19"/>
-                <w:u w:val="single"/>
-              </w:rPr>
-            </w:r>
-            <w:r>
-              <w:rPr>
-                <w:w w:val="99"/>
-                <w:sz w:val="19"/>
-                <w:u w:val="single"/>
-              </w:rPr>
-            </w:r>
-            <w:r>
-              <w:rPr>
-                <w:spacing w:val="-1"/>
-                <w:sz w:val="19"/>
-                <w:u w:val="single"/>
-              </w:rPr>
-            </w:r>
-            <w:r>
-              <w:rPr>
-                <w:w w:val="99"/>
-                <w:sz w:val="19"/>
-                <w:u w:val="single"/>
-              </w:rPr>
-            </w:r>
-            <w:r>
-              <w:rPr>
-                <w:sz w:val="19"/>
-                <w:u w:val="single"/>
-              </w:rPr>
-            </w:r>
-            <w:r>
-              <w:rPr>
-                <w:spacing w:val="2"/>
-                <w:w w:val="99"/>
-                <w:sz w:val="19"/>
-                <w:u w:val="single"/>
-              </w:rPr>
-            </w:r>
-            <w:r>
-              <w:rPr>
-                <w:spacing w:val="-2"/>
-                <w:w w:val="99"/>
-                <w:sz w:val="19"/>
-                <w:u w:val="single"/>
-              </w:rPr>
-            </w:r>
-            <w:r>
-              <w:rPr>
-                <w:spacing w:val="-1"/>
-                <w:w w:val="99"/>
-                <w:sz w:val="19"/>
-                <w:u w:val="single"/>
-              </w:rPr>
-            </w:r>
-            <w:r>
-              <w:rPr>
-                <w:w w:val="99"/>
-                <w:sz w:val="19"/>
-                <w:u w:val="single"/>
-              </w:rPr>
-            </w:r>
-            <w:r>
-              <w:rPr>
                 <w:sz w:val="19"/>
                 <w:u w:val="single"/>
               </w:rPr>
@@ -1088,7 +1165,7 @@
         </w:trPr>
         <w:tc>
           <w:tcPr>
-            <w:tcW w:w="2268" w:type="dxa"/>
+            <w:tcW w:w="2676" w:type="dxa"/>
           </w:tcPr>
           <w:p>
             <w:pPr>
@@ -1122,7 +1199,25 @@
                 <w:b/>
                 <w:sz w:val="20"/>
               </w:rPr>
-              <w:t xml:space="preserve">Registral N° </w:t>
+              <w:t xml:space="preserve">Registral </w:t>
+            </w:r>
+            <w:proofErr w:type="spellStart"/>
+            <w:r>
+              <w:rPr>
+                <w:rFonts w:ascii="Arial" w:hAnsi="Arial"/>
+                <w:b/>
+                <w:sz w:val="20"/>
+              </w:rPr>
+              <w:t>N°</w:t>
+            </w:r>
+            <w:proofErr w:type="spellEnd"/>
+            <w:r>
+              <w:rPr>
+                <w:rFonts w:ascii="Arial" w:hAnsi="Arial"/>
+                <w:b/>
+                <w:sz w:val="20"/>
+              </w:rPr>
+              <w:t xml:space="preserve"> </w:t>
             </w:r>
             <w:r>
               <w:rPr>
@@ -1175,34 +1270,11 @@
               </w:rPr>
               <w:t>{{PROYECTO}}</w:t>
             </w:r>
-            <w:r>
-              <w:rPr>
-                <w:rFonts w:ascii="Arial" w:hAnsi="Arial"/>
-                <w:b/>
-                <w:spacing w:val="-12"/>
-                <w:sz w:val="20"/>
-              </w:rPr>
-            </w:r>
-            <w:r>
-              <w:rPr>
-                <w:rFonts w:ascii="Arial" w:hAnsi="Arial"/>
-                <w:b/>
-                <w:spacing w:val="-2"/>
-                <w:sz w:val="20"/>
-              </w:rPr>
-            </w:r>
-            <w:r>
-              <w:rPr>
-                <w:rFonts w:ascii="Arial" w:hAnsi="Arial"/>
-                <w:b/>
-                <w:sz w:val="20"/>
-              </w:rPr>
-            </w:r>
           </w:p>
         </w:tc>
         <w:tc>
           <w:tcPr>
-            <w:tcW w:w="3486" w:type="dxa"/>
+            <w:tcW w:w="3701" w:type="dxa"/>
           </w:tcPr>
           <w:p>
             <w:pPr>
@@ -1373,7 +1445,7 @@
         </w:trPr>
         <w:tc>
           <w:tcPr>
-            <w:tcW w:w="2268" w:type="dxa"/>
+            <w:tcW w:w="2676" w:type="dxa"/>
           </w:tcPr>
           <w:p>
             <w:pPr>
@@ -1403,45 +1475,34 @@
               </w:rPr>
               <w:t xml:space="preserve"> </w:t>
             </w:r>
-            <w:r>
-              <w:rPr>
-                <w:rFonts w:ascii="Arial" w:hAnsi="Arial"/>
-                <w:b/>
-                <w:sz w:val="20"/>
-              </w:rPr>
-              <w:t>“ {{MANZANA}} ”</w:t>
-            </w:r>
-            <w:r>
-              <w:rPr>
-                <w:rFonts w:ascii="Arial" w:hAnsi="Arial"/>
-                <w:b/>
-                <w:spacing w:val="-5"/>
-                <w:sz w:val="20"/>
-              </w:rPr>
-            </w:r>
-            <w:r>
-              <w:rPr>
-                <w:rFonts w:ascii="Arial" w:hAnsi="Arial"/>
-                <w:b/>
-                <w:sz w:val="20"/>
-              </w:rPr>
-            </w:r>
-            <w:r>
-              <w:rPr>
-                <w:rFonts w:ascii="Arial" w:hAnsi="Arial"/>
-                <w:b/>
-                <w:spacing w:val="-6"/>
-                <w:sz w:val="20"/>
-              </w:rPr>
-            </w:r>
-            <w:r>
-              <w:rPr>
-                <w:rFonts w:ascii="Arial" w:hAnsi="Arial"/>
-                <w:b/>
-                <w:spacing w:val="-10"/>
-                <w:sz w:val="20"/>
-              </w:rPr>
-            </w:r>
+            <w:proofErr w:type="gramStart"/>
+            <w:r>
+              <w:rPr>
+                <w:rFonts w:ascii="Arial" w:hAnsi="Arial"/>
+                <w:b/>
+                <w:sz w:val="20"/>
+              </w:rPr>
+              <w:t>“ {</w:t>
+            </w:r>
+            <w:proofErr w:type="gramEnd"/>
+            <w:r>
+              <w:rPr>
+                <w:rFonts w:ascii="Arial" w:hAnsi="Arial"/>
+                <w:b/>
+                <w:sz w:val="20"/>
+              </w:rPr>
+              <w:t>{MANZANA}</w:t>
+            </w:r>
+            <w:proofErr w:type="gramStart"/>
+            <w:r>
+              <w:rPr>
+                <w:rFonts w:ascii="Arial" w:hAnsi="Arial"/>
+                <w:b/>
+                <w:sz w:val="20"/>
+              </w:rPr>
+              <w:t>} ”</w:t>
+            </w:r>
+            <w:proofErr w:type="gramEnd"/>
           </w:p>
         </w:tc>
         <w:tc>
@@ -1477,13 +1538,23 @@
               </w:rPr>
               <w:t xml:space="preserve"> </w:t>
             </w:r>
-            <w:r>
-              <w:rPr>
-                <w:rFonts w:ascii="Arial" w:hAnsi="Arial"/>
-                <w:b/>
-                <w:sz w:val="20"/>
-              </w:rPr>
-              <w:t>N°:</w:t>
+            <w:proofErr w:type="spellStart"/>
+            <w:r>
+              <w:rPr>
+                <w:rFonts w:ascii="Arial" w:hAnsi="Arial"/>
+                <w:b/>
+                <w:sz w:val="20"/>
+              </w:rPr>
+              <w:t>N°</w:t>
+            </w:r>
+            <w:proofErr w:type="spellEnd"/>
+            <w:r>
+              <w:rPr>
+                <w:rFonts w:ascii="Arial" w:hAnsi="Arial"/>
+                <w:b/>
+                <w:sz w:val="20"/>
+              </w:rPr>
+              <w:t>:</w:t>
             </w:r>
             <w:r>
               <w:rPr>
@@ -1507,7 +1578,7 @@
         </w:tc>
         <w:tc>
           <w:tcPr>
-            <w:tcW w:w="3486" w:type="dxa"/>
+            <w:tcW w:w="3701" w:type="dxa"/>
           </w:tcPr>
           <w:p>
             <w:pPr>
@@ -1557,14 +1628,25 @@
               </w:rPr>
               <w:t xml:space="preserve"> </w:t>
             </w:r>
-            <w:r>
-              <w:rPr>
-                <w:rFonts w:ascii="Arial" w:hAnsi="Arial"/>
-                <w:b/>
-                <w:spacing w:val="-2"/>
-                <w:sz w:val="20"/>
-              </w:rPr>
-              <w:t>aprox:</w:t>
+            <w:proofErr w:type="spellStart"/>
+            <w:r>
+              <w:rPr>
+                <w:rFonts w:ascii="Arial" w:hAnsi="Arial"/>
+                <w:b/>
+                <w:spacing w:val="-2"/>
+                <w:sz w:val="20"/>
+              </w:rPr>
+              <w:t>aprox</w:t>
+            </w:r>
+            <w:proofErr w:type="spellEnd"/>
+            <w:r>
+              <w:rPr>
+                <w:rFonts w:ascii="Arial" w:hAnsi="Arial"/>
+                <w:b/>
+                <w:spacing w:val="-2"/>
+                <w:sz w:val="20"/>
+              </w:rPr>
+              <w:t>:</w:t>
             </w:r>
             <w:r>
               <w:rPr>
@@ -1574,97 +1656,6 @@
               </w:rPr>
               <w:tab/>
               <w:t>{{AREA}} M2</w:t>
-            </w:r>
-            <w:r>
-              <w:rPr>
-                <w:rFonts w:ascii="Arial" w:hAnsi="Arial"/>
-                <w:b/>
-                <w:spacing w:val="-3"/>
-                <w:sz w:val="20"/>
-              </w:rPr>
-            </w:r>
-            <w:r>
-              <w:rPr>
-                <w:rFonts w:ascii="Arial" w:hAnsi="Arial"/>
-                <w:b/>
-                <w:sz w:val="20"/>
-              </w:rPr>
-            </w:r>
-            <w:r>
-              <w:rPr>
-                <w:rFonts w:ascii="Arial" w:hAnsi="Arial"/>
-                <w:b/>
-                <w:spacing w:val="-2"/>
-                <w:sz w:val="20"/>
-              </w:rPr>
-            </w:r>
-            <w:r>
-              <w:rPr>
-                <w:rFonts w:ascii="Arial" w:hAnsi="Arial"/>
-                <w:b/>
-                <w:sz w:val="20"/>
-              </w:rPr>
-            </w:r>
-            <w:r>
-              <w:rPr>
-                <w:rFonts w:ascii="Arial" w:hAnsi="Arial"/>
-                <w:b/>
-                <w:spacing w:val="-2"/>
-                <w:sz w:val="20"/>
-              </w:rPr>
-            </w:r>
-            <w:r>
-              <w:rPr>
-                <w:rFonts w:ascii="Arial" w:hAnsi="Arial"/>
-                <w:b/>
-                <w:sz w:val="20"/>
-              </w:rPr>
-            </w:r>
-            <w:r>
-              <w:rPr>
-                <w:rFonts w:ascii="Arial" w:hAnsi="Arial"/>
-                <w:b/>
-                <w:spacing w:val="-5"/>
-                <w:sz w:val="20"/>
-              </w:rPr>
-            </w:r>
-            <w:r>
-              <w:rPr>
-                <w:rFonts w:ascii="Arial" w:hAnsi="Arial"/>
-                <w:b/>
-                <w:sz w:val="20"/>
-              </w:rPr>
-            </w:r>
-            <w:r>
-              <w:rPr>
-                <w:rFonts w:ascii="Arial" w:hAnsi="Arial"/>
-                <w:b/>
-                <w:spacing w:val="-2"/>
-                <w:sz w:val="20"/>
-              </w:rPr>
-            </w:r>
-            <w:r>
-              <w:rPr>
-                <w:rFonts w:ascii="Arial" w:hAnsi="Arial"/>
-                <w:b/>
-                <w:sz w:val="20"/>
-              </w:rPr>
-            </w:r>
-            <w:r>
-              <w:rPr>
-                <w:rFonts w:ascii="Arial" w:hAnsi="Arial"/>
-                <w:b/>
-                <w:spacing w:val="-1"/>
-                <w:sz w:val="20"/>
-              </w:rPr>
-            </w:r>
-            <w:r>
-              <w:rPr>
-                <w:rFonts w:ascii="Arial" w:hAnsi="Arial"/>
-                <w:b/>
-                <w:spacing w:val="22"/>
-                <w:sz w:val="20"/>
-              </w:rPr>
             </w:r>
           </w:p>
         </w:tc>
@@ -1675,7 +1666,7 @@
         </w:trPr>
         <w:tc>
           <w:tcPr>
-            <w:tcW w:w="9442" w:type="dxa"/>
+            <w:tcW w:w="10065" w:type="dxa"/>
             <w:gridSpan w:val="4"/>
           </w:tcPr>
           <w:p>
@@ -1695,41 +1686,7 @@
                 <w:b/>
                 <w:sz w:val="28"/>
               </w:rPr>
-              <w:t>Vencimiento</w:t>
-            </w:r>
-            <w:r>
-              <w:rPr>
-                <w:rFonts w:ascii="Arial" w:hAnsi="Arial"/>
-                <w:b/>
-                <w:spacing w:val="9"/>
-                <w:sz w:val="28"/>
-              </w:rPr>
-              <w:t xml:space="preserve"> </w:t>
-            </w:r>
-            <w:r>
-              <w:rPr>
-                <w:rFonts w:ascii="Arial" w:hAnsi="Arial"/>
-                <w:b/>
-                <w:sz w:val="28"/>
-              </w:rPr>
-              <w:t>de</w:t>
-            </w:r>
-            <w:r>
-              <w:rPr>
-                <w:rFonts w:ascii="Arial" w:hAnsi="Arial"/>
-                <w:b/>
-                <w:spacing w:val="7"/>
-                <w:sz w:val="28"/>
-              </w:rPr>
-              <w:t xml:space="preserve"> </w:t>
-            </w:r>
-            <w:r>
-              <w:rPr>
-                <w:rFonts w:ascii="Arial" w:hAnsi="Arial"/>
-                <w:b/>
-                <w:sz w:val="28"/>
-              </w:rPr>
-              <w:t>contrato de separación</w:t>
+              <w:t>{{ETIQUETA_FECHA}}</w:t>
             </w:r>
             <w:r>
               <w:rPr>
@@ -1755,68 +1712,7 @@
                 <w:b/>
                 <w:sz w:val="28"/>
               </w:rPr>
-              <w:t>{{VENCIMIENTO}}</w:t>
-            </w:r>
-            <w:r>
-              <w:rPr>
-                <w:rFonts w:ascii="Arial" w:hAnsi="Arial"/>
-                <w:b/>
-                <w:spacing w:val="18"/>
-                <w:sz w:val="28"/>
-              </w:rPr>
-            </w:r>
-            <w:r>
-              <w:rPr>
-                <w:rFonts w:ascii="Arial" w:hAnsi="Arial"/>
-                <w:b/>
-                <w:sz w:val="28"/>
-              </w:rPr>
-            </w:r>
-            <w:r>
-              <w:rPr>
-                <w:rFonts w:ascii="Arial" w:hAnsi="Arial"/>
-                <w:b/>
-                <w:spacing w:val="18"/>
-                <w:sz w:val="28"/>
-              </w:rPr>
-            </w:r>
-            <w:r>
-              <w:rPr>
-                <w:rFonts w:ascii="Arial" w:hAnsi="Arial"/>
-                <w:b/>
-                <w:sz w:val="28"/>
-              </w:rPr>
-            </w:r>
-            <w:r>
-              <w:rPr>
-                <w:rFonts w:ascii="Arial" w:hAnsi="Arial"/>
-                <w:b/>
-                <w:spacing w:val="-1"/>
-                <w:sz w:val="28"/>
-              </w:rPr>
-            </w:r>
-            <w:r>
-              <w:rPr>
-                <w:rFonts w:ascii="Arial" w:hAnsi="Arial"/>
-                <w:b/>
-                <w:sz w:val="28"/>
-              </w:rPr>
-            </w:r>
-            <w:r>
-              <w:rPr>
-                <w:rFonts w:ascii="Arial" w:hAnsi="Arial"/>
-                <w:b/>
-                <w:spacing w:val="-4"/>
-                <w:sz w:val="28"/>
-              </w:rPr>
-            </w:r>
-            <w:r>
-              <w:rPr>
-                <w:rFonts w:ascii="Arial" w:hAnsi="Arial"/>
-                <w:b/>
-                <w:spacing w:val="-2"/>
-                <w:sz w:val="28"/>
-              </w:rPr>
+              <w:t>{{FECHA_LIMITE}}</w:t>
             </w:r>
           </w:p>
         </w:tc>
@@ -1827,7 +1723,7 @@
         </w:trPr>
         <w:tc>
           <w:tcPr>
-            <w:tcW w:w="4340" w:type="dxa"/>
+            <w:tcW w:w="4748" w:type="dxa"/>
             <w:gridSpan w:val="2"/>
           </w:tcPr>
           <w:p>
@@ -1854,7 +1750,7 @@
         </w:tc>
         <w:tc>
           <w:tcPr>
-            <w:tcW w:w="5102" w:type="dxa"/>
+            <w:tcW w:w="5317" w:type="dxa"/>
             <w:gridSpan w:val="2"/>
           </w:tcPr>
           <w:p>
@@ -1922,7 +1818,7 @@
         </w:trPr>
         <w:tc>
           <w:tcPr>
-            <w:tcW w:w="4340" w:type="dxa"/>
+            <w:tcW w:w="4748" w:type="dxa"/>
             <w:gridSpan w:val="2"/>
           </w:tcPr>
           <w:p>
@@ -2805,7 +2701,7 @@
         </w:tc>
         <w:tc>
           <w:tcPr>
-            <w:tcW w:w="5102" w:type="dxa"/>
+            <w:tcW w:w="5317" w:type="dxa"/>
             <w:gridSpan w:val="2"/>
           </w:tcPr>
           <w:p>
@@ -3772,7 +3668,7 @@
 </file>
 
 <file path=word/endnotes.xml><?xml version="1.0" encoding="utf-8"?>
-<w:endnotes xmlns:wpc="http://schemas.microsoft.com/office/word/2010/wordprocessingCanvas" xmlns:cx="http://schemas.microsoft.com/office/drawing/2014/chartex" xmlns:cx1="http://schemas.microsoft.com/office/drawing/2015/9/8/chartex" xmlns:cx2="http://schemas.microsoft.com/office/drawing/2015/10/21/chartex" xmlns:cx3="http://schemas.microsoft.com/office/drawing/2016/5/9/chartex" xmlns:cx4="http://schemas.microsoft.com/office/drawing/2016/5/10/chartex" xmlns:cx5="http://schemas.microsoft.com/office/drawing/2016/5/11/chartex" xmlns:cx6="http://schemas.microsoft.com/office/drawing/2016/5/12/chartex" xmlns:cx7="http://schemas.microsoft.com/office/drawing/2016/5/13/chartex" xmlns:cx8="http://schemas.microsoft.com/office/drawing/2016/5/14/chartex" xmlns:mc="http://schemas.openxmlformats.org/markup-compatibility/2006" xmlns:aink="http://schemas.microsoft.com/office/drawing/2016/ink" xmlns:am3d="http://schemas.microsoft.com/office/drawing/2017/model3d" xmlns:o="urn:schemas-microsoft-com:office:office" xmlns:oel="http://schemas.microsoft.com/office/2019/extlst" xmlns:r="http://schemas.openxmlformats.org/officeDocument/2006/relationships" xmlns:m="http://schemas.openxmlformats.org/officeDocument/2006/math" xmlns:v="urn:schemas-microsoft-com:vml" xmlns:wp14="http://schemas.microsoft.com/office/word/2010/wordprocessingDrawing" xmlns:wp="http://schemas.openxmlformats.org/drawingml/2006/wordprocessingDrawing" xmlns:w10="urn:schemas-microsoft-com:office:word" xmlns:w="http://schemas.openxmlformats.org/wordprocessingml/2006/main" xmlns:w14="http://schemas.microsoft.com/office/word/2010/wordml" xmlns:w15="http://schemas.microsoft.com/office/word/2012/wordml" xmlns:w16cex="http://schemas.microsoft.com/office/word/2018/wordml/cex" xmlns:w16cid="http://schemas.microsoft.com/office/word/2016/wordml/cid" xmlns:w16="http://schemas.microsoft.com/office/word/2018/wordml" xmlns:w16du="http://schemas.microsoft.com/office/word/2023/wordml/word16du" xmlns:w16sdtdh="http://schemas.microsoft.com/office/word/2020/wordml/sdtdatahash" xmlns:w16se="http://schemas.microsoft.com/office/word/2015/wordml/symex" xmlns:wpg="http://schemas.microsoft.com/office/word/2010/wordprocessingGroup" xmlns:wpi="http://schemas.microsoft.com/office/word/2010/wordprocessingInk" xmlns:wne="http://schemas.microsoft.com/office/word/2006/wordml" xmlns:wps="http://schemas.microsoft.com/office/word/2010/wordprocessingShape" mc:Ignorable="w14 w15 w16se w16cid w16 w16cex w16sdtdh w16du wp14">
+<w:endnotes xmlns:wpc="http://schemas.microsoft.com/office/word/2010/wordprocessingCanvas" xmlns:cx="http://schemas.microsoft.com/office/drawing/2014/chartex" xmlns:cx1="http://schemas.microsoft.com/office/drawing/2015/9/8/chartex" xmlns:cx2="http://schemas.microsoft.com/office/drawing/2015/10/21/chartex" xmlns:cx3="http://schemas.microsoft.com/office/drawing/2016/5/9/chartex" xmlns:cx4="http://schemas.microsoft.com/office/drawing/2016/5/10/chartex" xmlns:cx5="http://schemas.microsoft.com/office/drawing/2016/5/11/chartex" xmlns:cx6="http://schemas.microsoft.com/office/drawing/2016/5/12/chartex" xmlns:cx7="http://schemas.microsoft.com/office/drawing/2016/5/13/chartex" xmlns:cx8="http://schemas.microsoft.com/office/drawing/2016/5/14/chartex" xmlns:mc="http://schemas.openxmlformats.org/markup-compatibility/2006" xmlns:aink="http://schemas.microsoft.com/office/drawing/2016/ink" xmlns:am3d="http://schemas.microsoft.com/office/drawing/2017/model3d" xmlns:o="urn:schemas-microsoft-com:office:office" xmlns:oel="http://schemas.microsoft.com/office/2019/extlst" xmlns:r="http://schemas.openxmlformats.org/officeDocument/2006/relationships" xmlns:m="http://schemas.openxmlformats.org/officeDocument/2006/math" xmlns:v="urn:schemas-microsoft-com:vml" xmlns:wp14="http://schemas.microsoft.com/office/word/2010/wordprocessingDrawing" xmlns:wp="http://schemas.openxmlformats.org/drawingml/2006/wordprocessingDrawing" xmlns:w10="urn:schemas-microsoft-com:office:word" xmlns:w="http://schemas.openxmlformats.org/wordprocessingml/2006/main" xmlns:w14="http://schemas.microsoft.com/office/word/2010/wordml" xmlns:w15="http://schemas.microsoft.com/office/word/2012/wordml" xmlns:w16cex="http://schemas.microsoft.com/office/word/2018/wordml/cex" xmlns:w16cid="http://schemas.microsoft.com/office/word/2016/wordml/cid" xmlns:w16="http://schemas.microsoft.com/office/word/2018/wordml" xmlns:w16du="http://schemas.microsoft.com/office/word/2023/wordml/word16du" xmlns:w16sdtdh="http://schemas.microsoft.com/office/word/2020/wordml/sdtdatahash" xmlns:w16sdtfl="http://schemas.microsoft.com/office/word/2024/wordml/sdtformatlock" xmlns:w16se="http://schemas.microsoft.com/office/word/2015/wordml/symex" xmlns:wpg="http://schemas.microsoft.com/office/word/2010/wordprocessingGroup" xmlns:wpi="http://schemas.microsoft.com/office/word/2010/wordprocessingInk" xmlns:wne="http://schemas.microsoft.com/office/word/2006/wordml" xmlns:wps="http://schemas.microsoft.com/office/word/2010/wordprocessingShape" mc:Ignorable="w14 w15 w16se w16cid w16 w16cex w16sdtdh w16sdtfl w16du wp14">
   <w:endnote w:type="separator" w:id="-1">
     <w:p>
       <w:r>
@@ -3791,7 +3687,7 @@
 </file>
 
 <file path=word/footer1.xml><?xml version="1.0" encoding="utf-8"?>
-<w:ftr xmlns:wpc="http://schemas.microsoft.com/office/word/2010/wordprocessingCanvas" xmlns:cx="http://schemas.microsoft.com/office/drawing/2014/chartex" xmlns:cx1="http://schemas.microsoft.com/office/drawing/2015/9/8/chartex" xmlns:cx2="http://schemas.microsoft.com/office/drawing/2015/10/21/chartex" xmlns:cx3="http://schemas.microsoft.com/office/drawing/2016/5/9/chartex" xmlns:cx4="http://schemas.microsoft.com/office/drawing/2016/5/10/chartex" xmlns:cx5="http://schemas.microsoft.com/office/drawing/2016/5/11/chartex" xmlns:cx6="http://schemas.microsoft.com/office/drawing/2016/5/12/chartex" xmlns:cx7="http://schemas.microsoft.com/office/drawing/2016/5/13/chartex" xmlns:cx8="http://schemas.microsoft.com/office/drawing/2016/5/14/chartex" xmlns:mc="http://schemas.openxmlformats.org/markup-compatibility/2006" xmlns:aink="http://schemas.microsoft.com/office/drawing/2016/ink" xmlns:am3d="http://schemas.microsoft.com/office/drawing/2017/model3d" xmlns:o="urn:schemas-microsoft-com:office:office" xmlns:oel="http://schemas.microsoft.com/office/2019/extlst" xmlns:r="http://schemas.openxmlformats.org/officeDocument/2006/relationships" xmlns:m="http://schemas.openxmlformats.org/officeDocument/2006/math" xmlns:v="urn:schemas-microsoft-com:vml" xmlns:wp14="http://schemas.microsoft.com/office/word/2010/wordprocessingDrawing" xmlns:wp="http://schemas.openxmlformats.org/drawingml/2006/wordprocessingDrawing" xmlns:w10="urn:schemas-microsoft-com:office:word" xmlns:w="http://schemas.openxmlformats.org/wordprocessingml/2006/main" xmlns:w14="http://schemas.microsoft.com/office/word/2010/wordml" xmlns:w15="http://schemas.microsoft.com/office/word/2012/wordml" xmlns:w16cex="http://schemas.microsoft.com/office/word/2018/wordml/cex" xmlns:w16cid="http://schemas.microsoft.com/office/word/2016/wordml/cid" xmlns:w16="http://schemas.microsoft.com/office/word/2018/wordml" xmlns:w16du="http://schemas.microsoft.com/office/word/2023/wordml/word16du" xmlns:w16sdtdh="http://schemas.microsoft.com/office/word/2020/wordml/sdtdatahash" xmlns:w16se="http://schemas.microsoft.com/office/word/2015/wordml/symex" xmlns:wpg="http://schemas.microsoft.com/office/word/2010/wordprocessingGroup" xmlns:wpi="http://schemas.microsoft.com/office/word/2010/wordprocessingInk" xmlns:wne="http://schemas.microsoft.com/office/word/2006/wordml" xmlns:wps="http://schemas.microsoft.com/office/word/2010/wordprocessingShape" mc:Ignorable="w14 w15 w16se w16cid w16 w16cex w16sdtdh w16du wp14">
+<w:ftr xmlns:wpc="http://schemas.microsoft.com/office/word/2010/wordprocessingCanvas" xmlns:cx="http://schemas.microsoft.com/office/drawing/2014/chartex" xmlns:cx1="http://schemas.microsoft.com/office/drawing/2015/9/8/chartex" xmlns:cx2="http://schemas.microsoft.com/office/drawing/2015/10/21/chartex" xmlns:cx3="http://schemas.microsoft.com/office/drawing/2016/5/9/chartex" xmlns:cx4="http://schemas.microsoft.com/office/drawing/2016/5/10/chartex" xmlns:cx5="http://schemas.microsoft.com/office/drawing/2016/5/11/chartex" xmlns:cx6="http://schemas.microsoft.com/office/drawing/2016/5/12/chartex" xmlns:cx7="http://schemas.microsoft.com/office/drawing/2016/5/13/chartex" xmlns:cx8="http://schemas.microsoft.com/office/drawing/2016/5/14/chartex" xmlns:mc="http://schemas.openxmlformats.org/markup-compatibility/2006" xmlns:aink="http://schemas.microsoft.com/office/drawing/2016/ink" xmlns:am3d="http://schemas.microsoft.com/office/drawing/2017/model3d" xmlns:o="urn:schemas-microsoft-com:office:office" xmlns:oel="http://schemas.microsoft.com/office/2019/extlst" xmlns:r="http://schemas.openxmlformats.org/officeDocument/2006/relationships" xmlns:m="http://schemas.openxmlformats.org/officeDocument/2006/math" xmlns:v="urn:schemas-microsoft-com:vml" xmlns:wp14="http://schemas.microsoft.com/office/word/2010/wordprocessingDrawing" xmlns:wp="http://schemas.openxmlformats.org/drawingml/2006/wordprocessingDrawing" xmlns:w10="urn:schemas-microsoft-com:office:word" xmlns:w="http://schemas.openxmlformats.org/wordprocessingml/2006/main" xmlns:w14="http://schemas.microsoft.com/office/word/2010/wordml" xmlns:w15="http://schemas.microsoft.com/office/word/2012/wordml" xmlns:w16cex="http://schemas.microsoft.com/office/word/2018/wordml/cex" xmlns:w16cid="http://schemas.microsoft.com/office/word/2016/wordml/cid" xmlns:w16="http://schemas.microsoft.com/office/word/2018/wordml" xmlns:w16du="http://schemas.microsoft.com/office/word/2023/wordml/word16du" xmlns:w16sdtdh="http://schemas.microsoft.com/office/word/2020/wordml/sdtdatahash" xmlns:w16sdtfl="http://schemas.microsoft.com/office/word/2024/wordml/sdtformatlock" xmlns:w16se="http://schemas.microsoft.com/office/word/2015/wordml/symex" xmlns:wpg="http://schemas.microsoft.com/office/word/2010/wordprocessingGroup" xmlns:wpi="http://schemas.microsoft.com/office/word/2010/wordprocessingInk" xmlns:wne="http://schemas.microsoft.com/office/word/2006/wordml" xmlns:wps="http://schemas.microsoft.com/office/word/2010/wordprocessingShape" mc:Ignorable="w14 w15 w16se w16cid w16 w16cex w16sdtdh w16sdtfl w16du wp14">
   <w:p>
     <w:pPr>
       <w:pStyle w:val="Textoindependiente"/>
@@ -4277,7 +4173,7 @@
 </file>
 
 <file path=word/footnotes.xml><?xml version="1.0" encoding="utf-8"?>
-<w:footnotes xmlns:wpc="http://schemas.microsoft.com/office/word/2010/wordprocessingCanvas" xmlns:cx="http://schemas.microsoft.com/office/drawing/2014/chartex" xmlns:cx1="http://schemas.microsoft.com/office/drawing/2015/9/8/chartex" xmlns:cx2="http://schemas.microsoft.com/office/drawing/2015/10/21/chartex" xmlns:cx3="http://schemas.microsoft.com/office/drawing/2016/5/9/chartex" xmlns:cx4="http://schemas.microsoft.com/office/drawing/2016/5/10/chartex" xmlns:cx5="http://schemas.microsoft.com/office/drawing/2016/5/11/chartex" xmlns:cx6="http://schemas.microsoft.com/office/drawing/2016/5/12/chartex" xmlns:cx7="http://schemas.microsoft.com/office/drawing/2016/5/13/chartex" xmlns:cx8="http://schemas.microsoft.com/office/drawing/2016/5/14/chartex" xmlns:mc="http://schemas.openxmlformats.org/markup-compatibility/2006" xmlns:aink="http://schemas.microsoft.com/office/drawing/2016/ink" xmlns:am3d="http://schemas.microsoft.com/office/drawing/2017/model3d" xmlns:o="urn:schemas-microsoft-com:office:office" xmlns:oel="http://schemas.microsoft.com/office/2019/extlst" xmlns:r="http://schemas.openxmlformats.org/officeDocument/2006/relationships" xmlns:m="http://schemas.openxmlformats.org/officeDocument/2006/math" xmlns:v="urn:schemas-microsoft-com:vml" xmlns:wp14="http://schemas.microsoft.com/office/word/2010/wordprocessingDrawing" xmlns:wp="http://schemas.openxmlformats.org/drawingml/2006/wordprocessingDrawing" xmlns:w10="urn:schemas-microsoft-com:office:word" xmlns:w="http://schemas.openxmlformats.org/wordprocessingml/2006/main" xmlns:w14="http://schemas.microsoft.com/office/word/2010/wordml" xmlns:w15="http://schemas.microsoft.com/office/word/2012/wordml" xmlns:w16cex="http://schemas.microsoft.com/office/word/2018/wordml/cex" xmlns:w16cid="http://schemas.microsoft.com/office/word/2016/wordml/cid" xmlns:w16="http://schemas.microsoft.com/office/word/2018/wordml" xmlns:w16du="http://schemas.microsoft.com/office/word/2023/wordml/word16du" xmlns:w16sdtdh="http://schemas.microsoft.com/office/word/2020/wordml/sdtdatahash" xmlns:w16se="http://schemas.microsoft.com/office/word/2015/wordml/symex" xmlns:wpg="http://schemas.microsoft.com/office/word/2010/wordprocessingGroup" xmlns:wpi="http://schemas.microsoft.com/office/word/2010/wordprocessingInk" xmlns:wne="http://schemas.microsoft.com/office/word/2006/wordml" xmlns:wps="http://schemas.microsoft.com/office/word/2010/wordprocessingShape" mc:Ignorable="w14 w15 w16se w16cid w16 w16cex w16sdtdh w16du wp14">
+<w:footnotes xmlns:wpc="http://schemas.microsoft.com/office/word/2010/wordprocessingCanvas" xmlns:cx="http://schemas.microsoft.com/office/drawing/2014/chartex" xmlns:cx1="http://schemas.microsoft.com/office/drawing/2015/9/8/chartex" xmlns:cx2="http://schemas.microsoft.com/office/drawing/2015/10/21/chartex" xmlns:cx3="http://schemas.microsoft.com/office/drawing/2016/5/9/chartex" xmlns:cx4="http://schemas.microsoft.com/office/drawing/2016/5/10/chartex" xmlns:cx5="http://schemas.microsoft.com/office/drawing/2016/5/11/chartex" xmlns:cx6="http://schemas.microsoft.com/office/drawing/2016/5/12/chartex" xmlns:cx7="http://schemas.microsoft.com/office/drawing/2016/5/13/chartex" xmlns:cx8="http://schemas.microsoft.com/office/drawing/2016/5/14/chartex" xmlns:mc="http://schemas.openxmlformats.org/markup-compatibility/2006" xmlns:aink="http://schemas.microsoft.com/office/drawing/2016/ink" xmlns:am3d="http://schemas.microsoft.com/office/drawing/2017/model3d" xmlns:o="urn:schemas-microsoft-com:office:office" xmlns:oel="http://schemas.microsoft.com/office/2019/extlst" xmlns:r="http://schemas.openxmlformats.org/officeDocument/2006/relationships" xmlns:m="http://schemas.openxmlformats.org/officeDocument/2006/math" xmlns:v="urn:schemas-microsoft-com:vml" xmlns:wp14="http://schemas.microsoft.com/office/word/2010/wordprocessingDrawing" xmlns:wp="http://schemas.openxmlformats.org/drawingml/2006/wordprocessingDrawing" xmlns:w10="urn:schemas-microsoft-com:office:word" xmlns:w="http://schemas.openxmlformats.org/wordprocessingml/2006/main" xmlns:w14="http://schemas.microsoft.com/office/word/2010/wordml" xmlns:w15="http://schemas.microsoft.com/office/word/2012/wordml" xmlns:w16cex="http://schemas.microsoft.com/office/word/2018/wordml/cex" xmlns:w16cid="http://schemas.microsoft.com/office/word/2016/wordml/cid" xmlns:w16="http://schemas.microsoft.com/office/word/2018/wordml" xmlns:w16du="http://schemas.microsoft.com/office/word/2023/wordml/word16du" xmlns:w16sdtdh="http://schemas.microsoft.com/office/word/2020/wordml/sdtdatahash" xmlns:w16sdtfl="http://schemas.microsoft.com/office/word/2024/wordml/sdtformatlock" xmlns:w16se="http://schemas.microsoft.com/office/word/2015/wordml/symex" xmlns:wpg="http://schemas.microsoft.com/office/word/2010/wordprocessingGroup" xmlns:wpi="http://schemas.microsoft.com/office/word/2010/wordprocessingInk" xmlns:wne="http://schemas.microsoft.com/office/word/2006/wordml" xmlns:wps="http://schemas.microsoft.com/office/word/2010/wordprocessingShape" mc:Ignorable="w14 w15 w16se w16cid w16 w16cex w16sdtdh w16sdtfl w16du wp14">
   <w:footnote w:type="separator" w:id="-1">
     <w:p>
       <w:r>
@@ -4296,7 +4192,7 @@
 </file>
 
 <file path=word/styles.xml><?xml version="1.0" encoding="utf-8"?>
-<w:styles xmlns:mc="http://schemas.openxmlformats.org/markup-compatibility/2006" xmlns:r="http://schemas.openxmlformats.org/officeDocument/2006/relationships" xmlns:w="http://schemas.openxmlformats.org/wordprocessingml/2006/main" xmlns:w14="http://schemas.microsoft.com/office/word/2010/wordml" xmlns:w15="http://schemas.microsoft.com/office/word/2012/wordml" xmlns:w16cex="http://schemas.microsoft.com/office/word/2018/wordml/cex" xmlns:w16cid="http://schemas.microsoft.com/office/word/2016/wordml/cid" xmlns:w16="http://schemas.microsoft.com/office/word/2018/wordml" xmlns:w16du="http://schemas.microsoft.com/office/word/2023/wordml/word16du" xmlns:w16sdtdh="http://schemas.microsoft.com/office/word/2020/wordml/sdtdatahash" xmlns:w16se="http://schemas.microsoft.com/office/word/2015/wordml/symex" mc:Ignorable="w14 w15 w16se w16cid w16 w16cex w16sdtdh w16du">
+<w:styles xmlns:mc="http://schemas.openxmlformats.org/markup-compatibility/2006" xmlns:r="http://schemas.openxmlformats.org/officeDocument/2006/relationships" xmlns:w="http://schemas.openxmlformats.org/wordprocessingml/2006/main" xmlns:w14="http://schemas.microsoft.com/office/word/2010/wordml" xmlns:w15="http://schemas.microsoft.com/office/word/2012/wordml" xmlns:w16cex="http://schemas.microsoft.com/office/word/2018/wordml/cex" xmlns:w16cid="http://schemas.microsoft.com/office/word/2016/wordml/cid" xmlns:w16="http://schemas.microsoft.com/office/word/2018/wordml" xmlns:w16du="http://schemas.microsoft.com/office/word/2023/wordml/word16du" xmlns:w16sdtdh="http://schemas.microsoft.com/office/word/2020/wordml/sdtdatahash" xmlns:w16sdtfl="http://schemas.microsoft.com/office/word/2024/wordml/sdtformatlock" xmlns:w16se="http://schemas.microsoft.com/office/word/2015/wordml/symex" mc:Ignorable="w14 w15 w16se w16cid w16 w16cex w16sdtdh w16sdtfl w16du">
   <w:docDefaults>
     <w:rPrDefault>
       <w:rPr>
@@ -4703,7 +4599,6 @@
   <w:style w:type="character" w:default="1" w:styleId="Fuentedeprrafopredeter">
     <w:name w:val="Default Paragraph Font"/>
     <w:uiPriority w:val="1"/>
-    <w:semiHidden/>
     <w:unhideWhenUsed/>
   </w:style>
   <w:style w:type="table" w:default="1" w:styleId="Tablanormal">

</xml_diff>

<commit_message>
Solucionando doc de contrato y proformas dando ajustes
</commit_message>
<xml_diff>
--- a/backend/app/templates/plantilla_separacion.docx
+++ b/backend/app/templates/plantilla_separacion.docx
@@ -1,12 +1,12 @@
 
 <file path=word/document.xml><?xml version="1.0" encoding="utf-8"?>
-<w:document xmlns:wpc="http://schemas.microsoft.com/office/word/2010/wordprocessingCanvas" xmlns:cx="http://schemas.microsoft.com/office/drawing/2014/chartex" xmlns:cx1="http://schemas.microsoft.com/office/drawing/2015/9/8/chartex" xmlns:cx2="http://schemas.microsoft.com/office/drawing/2015/10/21/chartex" xmlns:cx3="http://schemas.microsoft.com/office/drawing/2016/5/9/chartex" xmlns:cx4="http://schemas.microsoft.com/office/drawing/2016/5/10/chartex" xmlns:cx5="http://schemas.microsoft.com/office/drawing/2016/5/11/chartex" xmlns:cx6="http://schemas.microsoft.com/office/drawing/2016/5/12/chartex" xmlns:cx7="http://schemas.microsoft.com/office/drawing/2016/5/13/chartex" xmlns:cx8="http://schemas.microsoft.com/office/drawing/2016/5/14/chartex" xmlns:mc="http://schemas.openxmlformats.org/markup-compatibility/2006" xmlns:aink="http://schemas.microsoft.com/office/drawing/2016/ink" xmlns:am3d="http://schemas.microsoft.com/office/drawing/2017/model3d" xmlns:o="urn:schemas-microsoft-com:office:office" xmlns:oel="http://schemas.microsoft.com/office/2019/extlst" xmlns:r="http://schemas.openxmlformats.org/officeDocument/2006/relationships" xmlns:m="http://schemas.openxmlformats.org/officeDocument/2006/math" xmlns:v="urn:schemas-microsoft-com:vml" xmlns:wp14="http://schemas.microsoft.com/office/word/2010/wordprocessingDrawing" xmlns:wp="http://schemas.openxmlformats.org/drawingml/2006/wordprocessingDrawing" xmlns:w10="urn:schemas-microsoft-com:office:word" xmlns:w="http://schemas.openxmlformats.org/wordprocessingml/2006/main" xmlns:w14="http://schemas.microsoft.com/office/word/2010/wordml" xmlns:w15="http://schemas.microsoft.com/office/word/2012/wordml" xmlns:w16cex="http://schemas.microsoft.com/office/word/2018/wordml/cex" xmlns:w16cid="http://schemas.microsoft.com/office/word/2016/wordml/cid" xmlns:w16="http://schemas.microsoft.com/office/word/2018/wordml" xmlns:w16du="http://schemas.microsoft.com/office/word/2023/wordml/word16du" xmlns:w16sdtdh="http://schemas.microsoft.com/office/word/2020/wordml/sdtdatahash" xmlns:w16sdtfl="http://schemas.microsoft.com/office/word/2024/wordml/sdtformatlock" xmlns:w16se="http://schemas.microsoft.com/office/word/2015/wordml/symex" xmlns:wpg="http://schemas.microsoft.com/office/word/2010/wordprocessingGroup" xmlns:wpi="http://schemas.microsoft.com/office/word/2010/wordprocessingInk" xmlns:wne="http://schemas.microsoft.com/office/word/2006/wordml" xmlns:wps="http://schemas.microsoft.com/office/word/2010/wordprocessingShape" mc:Ignorable="w14 w15 w16se w16cid w16 w16cex w16sdtdh w16sdtfl w16du wp14">
+<w:document xmlns:wpc="http://schemas.microsoft.com/office/word/2010/wordprocessingCanvas" xmlns:cx="http://schemas.microsoft.com/office/drawing/2014/chartex" xmlns:cx1="http://schemas.microsoft.com/office/drawing/2015/9/8/chartex" xmlns:cx2="http://schemas.microsoft.com/office/drawing/2015/10/21/chartex" xmlns:cx3="http://schemas.microsoft.com/office/drawing/2016/5/9/chartex" xmlns:cx4="http://schemas.microsoft.com/office/drawing/2016/5/10/chartex" xmlns:cx5="http://schemas.microsoft.com/office/drawing/2016/5/11/chartex" xmlns:cx6="http://schemas.microsoft.com/office/drawing/2016/5/12/chartex" xmlns:cx7="http://schemas.microsoft.com/office/drawing/2016/5/13/chartex" xmlns:cx8="http://schemas.microsoft.com/office/drawing/2016/5/14/chartex" xmlns:mc="http://schemas.openxmlformats.org/markup-compatibility/2006" xmlns:aink="http://schemas.microsoft.com/office/drawing/2016/ink" xmlns:am3d="http://schemas.microsoft.com/office/drawing/2017/model3d" xmlns:o="urn:schemas-microsoft-com:office:office" xmlns:oel="http://schemas.microsoft.com/office/2019/extlst" xmlns:r="http://schemas.openxmlformats.org/officeDocument/2006/relationships" xmlns:m="http://schemas.openxmlformats.org/officeDocument/2006/math" xmlns:v="urn:schemas-microsoft-com:vml" xmlns:wp14="http://schemas.microsoft.com/office/word/2010/wordprocessingDrawing" xmlns:wp="http://schemas.openxmlformats.org/drawingml/2006/wordprocessingDrawing" xmlns:w10="urn:schemas-microsoft-com:office:word" xmlns:w="http://schemas.openxmlformats.org/wordprocessingml/2006/main" xmlns:w14="http://schemas.microsoft.com/office/word/2010/wordml" xmlns:w15="http://schemas.microsoft.com/office/word/2012/wordml" xmlns:w16cex="http://schemas.microsoft.com/office/word/2018/wordml/cex" xmlns:w16cid="http://schemas.microsoft.com/office/word/2016/wordml/cid" xmlns:w16="http://schemas.microsoft.com/office/word/2018/wordml" xmlns:w16du="http://schemas.microsoft.com/office/word/2023/wordml/word16du" xmlns:w16sdtdh="http://schemas.microsoft.com/office/word/2020/wordml/sdtdatahash" xmlns:w16se="http://schemas.microsoft.com/office/word/2015/wordml/symex" xmlns:wpg="http://schemas.microsoft.com/office/word/2010/wordprocessingGroup" xmlns:wpi="http://schemas.microsoft.com/office/word/2010/wordprocessingInk" xmlns:wne="http://schemas.microsoft.com/office/word/2006/wordml" xmlns:wps="http://schemas.microsoft.com/office/word/2010/wordprocessingShape" mc:Ignorable="w14 w15 w16se w16cid w16 w16cex w16sdtdh w16du wp14">
   <w:body>
     <w:tbl>
       <w:tblPr>
         <w:tblStyle w:val="TableNormal"/>
-        <w:tblW w:w="10065" w:type="dxa"/>
-        <w:tblInd w:w="-279" w:type="dxa"/>
+        <w:tblW w:w="0" w:type="auto"/>
+        <w:tblInd w:w="129" w:type="dxa"/>
         <w:tblBorders>
           <w:top w:val="single" w:sz="4" w:space="0" w:color="000000"/>
           <w:left w:val="single" w:sz="4" w:space="0" w:color="000000"/>
@@ -19,10 +19,10 @@
         <w:tblLook w:val="01E0" w:firstRow="1" w:lastRow="1" w:firstColumn="1" w:lastColumn="1" w:noHBand="0" w:noVBand="0"/>
       </w:tblPr>
       <w:tblGrid>
-        <w:gridCol w:w="2676"/>
+        <w:gridCol w:w="2268"/>
         <w:gridCol w:w="2072"/>
         <w:gridCol w:w="1616"/>
-        <w:gridCol w:w="3701"/>
+        <w:gridCol w:w="3486"/>
       </w:tblGrid>
       <w:tr>
         <w:trPr>
@@ -30,12 +30,18 @@
         </w:trPr>
         <w:tc>
           <w:tcPr>
-            <w:tcW w:w="10065" w:type="dxa"/>
+            <w:tcW w:w="9442" w:type="dxa"/>
             <w:gridSpan w:val="4"/>
           </w:tcPr>
           <w:p>
             <w:pPr>
-              <w:pStyle w:val="Prrafodelista"/>
+              <w:pStyle w:val="TableParagraph"/>
+              <w:spacing w:before="27"/>
+              <w:ind w:left="0"/>
+              <w:rPr>
+                <w:rFonts w:ascii="Times New Roman"/>
+                <w:sz w:val="25"/>
+              </w:rPr>
             </w:pPr>
           </w:p>
           <w:p>
@@ -81,7 +87,7 @@
               <mc:AlternateContent>
                 <mc:Choice Requires="wpg">
                   <w:drawing>
-                    <wp:anchor distT="0" distB="0" distL="0" distR="0" simplePos="0" relativeHeight="251658752" behindDoc="1" locked="0" layoutInCell="1" allowOverlap="1" wp14:anchorId="6D3ED61D" wp14:editId="1EA8FA6B">
+                    <wp:anchor distT="0" distB="0" distL="0" distR="0" simplePos="0" relativeHeight="487522816" behindDoc="1" locked="0" layoutInCell="1" allowOverlap="1" wp14:anchorId="6D3ED61D" wp14:editId="1EA8FA6B">
                       <wp:simplePos x="0" y="0"/>
                       <wp:positionH relativeFrom="column">
                         <wp:posOffset>155143</wp:posOffset>
@@ -139,7 +145,7 @@
                 </mc:Choice>
                 <mc:Fallback>
                   <w:pict>
-                    <v:group w14:anchorId="10D05CA2" id="Group 4" o:spid="_x0000_s1026" style="position:absolute;margin-left:12.2pt;margin-top:-20.85pt;width:78.65pt;height:42.75pt;z-index:-251657728;mso-wrap-distance-left:0;mso-wrap-distance-right:0" coordsize="9988,5429" o:gfxdata="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">
+                    <v:group w14:anchorId="32805C6F" id="Group 4" o:spid="_x0000_s1026" style="position:absolute;margin-left:12.2pt;margin-top:-20.85pt;width:78.65pt;height:42.75pt;z-index:-15793664;mso-wrap-distance-left:0;mso-wrap-distance-right:0" coordsize="9988,5429" o:gfxdata="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">
                       <v:shapetype id="_x0000_t75" coordsize="21600,21600" o:spt="75" o:preferrelative="t" path="m@4@5l@4@11@9@11@9@5xe" filled="f" stroked="f">
                         <v:stroke joinstyle="miter"/>
                         <v:formulas>
@@ -201,7 +207,6 @@
               </w:rPr>
               <w:t xml:space="preserve"> </w:t>
             </w:r>
-            <w:proofErr w:type="spellStart"/>
             <w:r>
               <w:rPr>
                 <w:rFonts w:ascii="Arial" w:hAnsi="Arial"/>
@@ -210,7 +215,6 @@
               </w:rPr>
               <w:t>N°</w:t>
             </w:r>
-            <w:proofErr w:type="spellEnd"/>
             <w:r>
               <w:rPr>
                 <w:rFonts w:ascii="Arial" w:hAnsi="Arial"/>
@@ -238,7 +242,7 @@
         </w:trPr>
         <w:tc>
           <w:tcPr>
-            <w:tcW w:w="10065" w:type="dxa"/>
+            <w:tcW w:w="9442" w:type="dxa"/>
             <w:gridSpan w:val="4"/>
           </w:tcPr>
           <w:p>
@@ -280,16 +284,7 @@
                 <w:b/>
                 <w:sz w:val="24"/>
               </w:rPr>
-              <w:t>Separación</w:t>
-            </w:r>
-            <w:proofErr w:type="gramStart"/>
-            <w:r>
-              <w:rPr>
-                <w:rFonts w:ascii="Arial" w:hAnsi="Arial"/>
-                <w:b/>
-                <w:sz w:val="24"/>
-              </w:rPr>
-              <w:t>:</w:t>
+              <w:t>Separación:</w:t>
             </w:r>
             <w:r>
               <w:rPr>
@@ -306,16 +301,53 @@
                 <w:b/>
                 <w:sz w:val="24"/>
               </w:rPr>
-              <w:t>{</w:t>
-            </w:r>
-            <w:proofErr w:type="gramEnd"/>
-            <w:r>
-              <w:rPr>
-                <w:rFonts w:ascii="Arial" w:hAnsi="Arial"/>
-                <w:b/>
+              <w:t>{{FECHA}}</w:t>
+            </w:r>
+            <w:r>
+              <w:rPr>
+                <w:rFonts w:ascii="Arial" w:hAnsi="Arial"/>
+                <w:b/>
+                <w:spacing w:val="1"/>
                 <w:sz w:val="24"/>
               </w:rPr>
-              <w:t>{FECHA}}</w:t>
+            </w:r>
+            <w:r>
+              <w:rPr>
+                <w:rFonts w:ascii="Arial" w:hAnsi="Arial"/>
+                <w:b/>
+                <w:sz w:val="24"/>
+              </w:rPr>
+            </w:r>
+            <w:r>
+              <w:rPr>
+                <w:rFonts w:ascii="Arial" w:hAnsi="Arial"/>
+                <w:b/>
+                <w:spacing w:val="62"/>
+                <w:sz w:val="24"/>
+              </w:rPr>
+            </w:r>
+            <w:r>
+              <w:rPr>
+                <w:rFonts w:ascii="Arial" w:hAnsi="Arial"/>
+                <w:b/>
+                <w:sz w:val="24"/>
+              </w:rPr>
+            </w:r>
+            <w:r>
+              <w:rPr>
+                <w:rFonts w:ascii="Arial" w:hAnsi="Arial"/>
+                <w:b/>
+                <w:spacing w:val="62"/>
+                <w:sz w:val="24"/>
+              </w:rPr>
+            </w:r>
+            <w:r>
+              <w:rPr>
+                <w:rFonts w:ascii="Arial" w:hAnsi="Arial"/>
+                <w:b/>
+                <w:spacing w:val="-4"/>
+                <w:sz w:val="24"/>
+              </w:rPr>
             </w:r>
             <w:r>
               <w:rPr>
@@ -381,6 +413,22 @@
               </w:rPr>
               <w:tab/>
               <w:t>{{IMPORTE}}</w:t>
+            </w:r>
+            <w:r>
+              <w:rPr>
+                <w:rFonts w:ascii="Arial" w:hAnsi="Arial"/>
+                <w:b/>
+                <w:spacing w:val="-3"/>
+                <w:sz w:val="21"/>
+              </w:rPr>
+            </w:r>
+            <w:r>
+              <w:rPr>
+                <w:rFonts w:ascii="Arial" w:hAnsi="Arial"/>
+                <w:b/>
+                <w:spacing w:val="-5"/>
+                <w:sz w:val="21"/>
+              </w:rPr>
             </w:r>
           </w:p>
         </w:tc>
@@ -391,7 +439,7 @@
         </w:trPr>
         <w:tc>
           <w:tcPr>
-            <w:tcW w:w="6364" w:type="dxa"/>
+            <w:tcW w:w="5956" w:type="dxa"/>
             <w:gridSpan w:val="3"/>
           </w:tcPr>
           <w:p>
@@ -468,11 +516,27 @@
               </w:rPr>
               <w:t>{{FORMA_PAGO}}</w:t>
             </w:r>
+            <w:r>
+              <w:rPr>
+                <w:rFonts w:ascii="Arial"/>
+                <w:b/>
+                <w:spacing w:val="-10"/>
+                <w:sz w:val="20"/>
+              </w:rPr>
+            </w:r>
+            <w:r>
+              <w:rPr>
+                <w:rFonts w:ascii="Arial"/>
+                <w:b/>
+                <w:spacing w:val="-2"/>
+                <w:sz w:val="20"/>
+              </w:rPr>
+            </w:r>
           </w:p>
         </w:tc>
         <w:tc>
           <w:tcPr>
-            <w:tcW w:w="3701" w:type="dxa"/>
+            <w:tcW w:w="3486" w:type="dxa"/>
           </w:tcPr>
           <w:p>
             <w:pPr>
@@ -485,7 +549,6 @@
                 <w:sz w:val="18"/>
               </w:rPr>
             </w:pPr>
-            <w:proofErr w:type="spellStart"/>
             <w:r>
               <w:rPr>
                 <w:rFonts w:ascii="Arial" w:hAnsi="Arial"/>
@@ -494,7 +557,6 @@
               </w:rPr>
               <w:t>Voucher</w:t>
             </w:r>
-            <w:proofErr w:type="spellEnd"/>
             <w:r>
               <w:rPr>
                 <w:rFonts w:ascii="Arial" w:hAnsi="Arial"/>
@@ -504,23 +566,13 @@
               </w:rPr>
               <w:t xml:space="preserve"> </w:t>
             </w:r>
-            <w:proofErr w:type="spellStart"/>
             <w:r>
               <w:rPr>
                 <w:rFonts w:ascii="Arial" w:hAnsi="Arial"/>
                 <w:b/>
                 <w:sz w:val="18"/>
               </w:rPr>
-              <w:t>N°</w:t>
-            </w:r>
-            <w:proofErr w:type="spellEnd"/>
-            <w:r>
-              <w:rPr>
-                <w:rFonts w:ascii="Arial" w:hAnsi="Arial"/>
-                <w:b/>
-                <w:sz w:val="18"/>
-              </w:rPr>
-              <w:t>:</w:t>
+              <w:t>N°:</w:t>
             </w:r>
             <w:r>
               <w:rPr>
@@ -545,11 +597,11 @@
       </w:tr>
       <w:tr>
         <w:trPr>
-          <w:trHeight w:val="1871"/>
+          <w:trHeight w:val="2121"/>
         </w:trPr>
         <w:tc>
           <w:tcPr>
-            <w:tcW w:w="10065" w:type="dxa"/>
+            <w:tcW w:w="9442" w:type="dxa"/>
             <w:gridSpan w:val="4"/>
           </w:tcPr>
           <w:p>
@@ -582,9 +634,8 @@
                 <w:sz w:val="19"/>
                 <w:u w:val="single"/>
               </w:rPr>
-              <w:t xml:space="preserve"> {{CLIENTE</w:t>
-            </w:r>
-            <w:proofErr w:type="gramStart"/>
+              <w:t xml:space="preserve"> {{CLIENTE}}</w:t>
+            </w:r>
             <w:r>
               <w:rPr>
                 <w:rFonts w:ascii="Arial"/>
@@ -592,99 +643,44 @@
                 <w:sz w:val="19"/>
                 <w:u w:val="single"/>
               </w:rPr>
-              <w:t>}}</w:t>
+              <w:tab/>
             </w:r>
             <w:r>
               <w:rPr>
                 <w:rFonts w:ascii="Arial"/>
                 <w:b/>
                 <w:sz w:val="19"/>
+              </w:rPr>
+              <w:t xml:space="preserve"> DNI:</w:t>
+            </w:r>
+            <w:r>
+              <w:rPr>
+                <w:rFonts w:ascii="Arial"/>
+                <w:b/>
+                <w:spacing w:val="-4"/>
+                <w:sz w:val="19"/>
+              </w:rPr>
+              <w:t xml:space="preserve"> </w:t>
+            </w:r>
+            <w:r>
+              <w:rPr>
+                <w:rFonts w:ascii="Arial"/>
+                <w:b/>
+                <w:spacing w:val="-4"/>
+                <w:sz w:val="19"/>
                 <w:u w:val="single"/>
               </w:rPr>
-              <w:t xml:space="preserve">   </w:t>
-            </w:r>
-            <w:proofErr w:type="gramEnd"/>
+              <w:t xml:space="preserve"> </w:t>
+            </w:r>
             <w:r>
               <w:rPr>
                 <w:rFonts w:ascii="Arial"/>
                 <w:b/>
+                <w:spacing w:val="-2"/>
                 <w:sz w:val="19"/>
                 <w:u w:val="single"/>
               </w:rPr>
-              <w:t xml:space="preserve">                                            </w:t>
-            </w:r>
-            <w:r>
-              <w:rPr>
-                <w:rFonts w:ascii="Arial"/>
-                <w:b/>
-                <w:sz w:val="19"/>
-              </w:rPr>
-              <w:t xml:space="preserve"> </w:t>
-            </w:r>
-            <w:r>
-              <w:rPr>
-                <w:rFonts w:ascii="Arial"/>
-                <w:b/>
-                <w:sz w:val="19"/>
-              </w:rPr>
-              <w:t xml:space="preserve">     </w:t>
-            </w:r>
-            <w:r>
-              <w:rPr>
-                <w:rFonts w:ascii="Arial"/>
-                <w:b/>
-                <w:sz w:val="19"/>
-              </w:rPr>
-              <w:t>DNI</w:t>
-            </w:r>
-            <w:proofErr w:type="gramStart"/>
-            <w:r>
-              <w:rPr>
-                <w:rFonts w:ascii="Arial"/>
-                <w:b/>
-                <w:sz w:val="19"/>
-              </w:rPr>
-              <w:t>:</w:t>
-            </w:r>
-            <w:r>
-              <w:rPr>
-                <w:rFonts w:ascii="Arial"/>
-                <w:b/>
-                <w:spacing w:val="-4"/>
-                <w:sz w:val="19"/>
-              </w:rPr>
-              <w:t xml:space="preserve"> </w:t>
-            </w:r>
-            <w:r>
-              <w:rPr>
-                <w:rFonts w:ascii="Arial"/>
-                <w:b/>
-                <w:spacing w:val="-4"/>
-                <w:sz w:val="19"/>
-                <w:u w:val="single"/>
-              </w:rPr>
-              <w:t xml:space="preserve"> </w:t>
-            </w:r>
-            <w:r>
-              <w:rPr>
-                <w:rFonts w:ascii="Arial"/>
-                <w:b/>
-                <w:spacing w:val="-2"/>
-                <w:sz w:val="19"/>
-                <w:u w:val="single"/>
-              </w:rPr>
-              <w:t>{</w:t>
-            </w:r>
-            <w:proofErr w:type="gramEnd"/>
-            <w:r>
-              <w:rPr>
-                <w:rFonts w:ascii="Arial"/>
-                <w:b/>
-                <w:spacing w:val="-2"/>
-                <w:sz w:val="19"/>
-                <w:u w:val="single"/>
-              </w:rPr>
-              <w:t>{DNI}}</w:t>
+              <w:t>{{DNI}}</w:t>
             </w:r>
             <w:r>
               <w:rPr>
@@ -709,28 +705,26 @@
               <w:ind w:left="86" w:right="-58"/>
               <w:jc w:val="both"/>
               <w:rPr>
+                <w:sz w:val="19"/>
+              </w:rPr>
+            </w:pPr>
+            <w:r>
+              <w:rPr>
+                <w:rFonts w:ascii="Arial" w:hAnsi="Arial"/>
+                <w:b/>
+                <w:sz w:val="19"/>
+              </w:rPr>
+              <w:t xml:space="preserve">Dirección: </w:t>
+            </w:r>
+            <w:r>
+              <w:rPr>
                 <w:rFonts w:ascii="Arial" w:hAnsi="Arial"/>
                 <w:b/>
                 <w:sz w:val="19"/>
                 <w:u w:val="single"/>
               </w:rPr>
-            </w:pPr>
-            <w:r>
-              <w:rPr>
-                <w:rFonts w:ascii="Arial" w:hAnsi="Arial"/>
-                <w:b/>
-                <w:sz w:val="19"/>
-              </w:rPr>
-              <w:t>Dirección</w:t>
-            </w:r>
-            <w:proofErr w:type="gramStart"/>
-            <w:r>
-              <w:rPr>
-                <w:rFonts w:ascii="Arial" w:hAnsi="Arial"/>
-                <w:b/>
-                <w:sz w:val="19"/>
-              </w:rPr>
-              <w:t xml:space="preserve">: </w:t>
+              <w:t xml:space="preserve"> {{DIRECCION}}</w:t>
+              <w:tab/>
             </w:r>
             <w:r>
               <w:rPr>
@@ -739,9 +733,8 @@
                 <w:sz w:val="19"/>
                 <w:u w:val="single"/>
               </w:rPr>
-              <w:t xml:space="preserve"> {</w:t>
-            </w:r>
-            <w:proofErr w:type="gramEnd"/>
+              <w:tab/>
+            </w:r>
             <w:r>
               <w:rPr>
                 <w:rFonts w:ascii="Arial" w:hAnsi="Arial"/>
@@ -749,9 +742,8 @@
                 <w:sz w:val="19"/>
                 <w:u w:val="single"/>
               </w:rPr>
-              <w:t>{DIRECCION</w:t>
-            </w:r>
-            <w:proofErr w:type="gramStart"/>
+              <w:tab/>
+            </w:r>
             <w:r>
               <w:rPr>
                 <w:rFonts w:ascii="Arial" w:hAnsi="Arial"/>
@@ -759,7 +751,15 @@
                 <w:sz w:val="19"/>
                 <w:u w:val="single"/>
               </w:rPr>
-              <w:t>}}</w:t>
+              <w:tab/>
+            </w:r>
+            <w:r>
+              <w:rPr>
+                <w:rFonts w:ascii="Arial" w:hAnsi="Arial"/>
+                <w:b/>
+                <w:sz w:val="19"/>
+              </w:rPr>
+              <w:t xml:space="preserve"> Email: </w:t>
             </w:r>
             <w:r>
               <w:rPr>
@@ -768,9 +768,17 @@
                 <w:sz w:val="19"/>
                 <w:u w:val="single"/>
               </w:rPr>
-              <w:t xml:space="preserve">   </w:t>
-            </w:r>
-            <w:proofErr w:type="gramEnd"/>
+              <w:t xml:space="preserve"> {{EMAIL}}</w:t>
+              <w:tab/>
+            </w:r>
+            <w:r>
+              <w:rPr>
+                <w:rFonts w:ascii="Arial" w:hAnsi="Arial"/>
+                <w:b/>
+                <w:sz w:val="19"/>
+              </w:rPr>
+              <w:t xml:space="preserve">Celular 1: </w:t>
+            </w:r>
             <w:r>
               <w:rPr>
                 <w:rFonts w:ascii="Arial" w:hAnsi="Arial"/>
@@ -778,24 +786,7 @@
                 <w:sz w:val="19"/>
                 <w:u w:val="single"/>
               </w:rPr>
-              <w:t xml:space="preserve">                                        </w:t>
-            </w:r>
-            <w:r>
-              <w:rPr>
-                <w:rFonts w:ascii="Arial" w:hAnsi="Arial"/>
-                <w:b/>
-                <w:sz w:val="19"/>
-              </w:rPr>
-              <w:t>Email</w:t>
-            </w:r>
-            <w:proofErr w:type="gramStart"/>
-            <w:r>
-              <w:rPr>
-                <w:rFonts w:ascii="Arial" w:hAnsi="Arial"/>
-                <w:b/>
-                <w:sz w:val="19"/>
-              </w:rPr>
-              <w:t xml:space="preserve">: </w:t>
+              <w:t xml:space="preserve"> {{CELULAR1}}</w:t>
             </w:r>
             <w:r>
               <w:rPr>
@@ -804,9 +795,16 @@
                 <w:sz w:val="19"/>
                 <w:u w:val="single"/>
               </w:rPr>
-              <w:t xml:space="preserve"> {</w:t>
-            </w:r>
-            <w:proofErr w:type="gramEnd"/>
+              <w:tab/>
+            </w:r>
+            <w:r>
+              <w:rPr>
+                <w:rFonts w:ascii="Arial" w:hAnsi="Arial"/>
+                <w:b/>
+                <w:sz w:val="19"/>
+              </w:rPr>
+              <w:t xml:space="preserve"> Celular 2: </w:t>
+            </w:r>
             <w:r>
               <w:rPr>
                 <w:rFonts w:ascii="Arial" w:hAnsi="Arial"/>
@@ -814,7 +812,8 @@
                 <w:sz w:val="19"/>
                 <w:u w:val="single"/>
               </w:rPr>
-              <w:t>{EMAIL}}</w:t>
+              <w:t xml:space="preserve"> {{CELULAR2}}</w:t>
+              <w:tab/>
             </w:r>
             <w:r>
               <w:rPr>
@@ -830,157 +829,15 @@
                 <w:rFonts w:ascii="Arial" w:hAnsi="Arial"/>
                 <w:b/>
                 <w:sz w:val="19"/>
+              </w:rPr>
+              <w:t xml:space="preserve"> Importe de la separación: </w:t>
+            </w:r>
+            <w:r>
+              <w:rPr>
+                <w:sz w:val="19"/>
                 <w:u w:val="single"/>
               </w:rPr>
-              <w:t xml:space="preserve">                                              </w:t>
-            </w:r>
-          </w:p>
-          <w:p>
-            <w:pPr>
-              <w:pStyle w:val="TableParagraph"/>
-              <w:tabs>
-                <w:tab w:val="left" w:pos="4398"/>
-                <w:tab w:val="left" w:pos="7011"/>
-                <w:tab w:val="left" w:pos="9435"/>
-                <w:tab w:val="left" w:pos="9482"/>
-              </w:tabs>
-              <w:spacing w:line="369" w:lineRule="auto"/>
-              <w:ind w:left="86" w:right="-58"/>
-              <w:jc w:val="both"/>
-              <w:rPr>
-                <w:sz w:val="19"/>
-              </w:rPr>
-            </w:pPr>
-            <w:r>
-              <w:rPr>
-                <w:rFonts w:ascii="Arial" w:hAnsi="Arial"/>
-                <w:b/>
-                <w:sz w:val="19"/>
-              </w:rPr>
-              <w:t>Celular 1</w:t>
-            </w:r>
-            <w:proofErr w:type="gramStart"/>
-            <w:r>
-              <w:rPr>
-                <w:rFonts w:ascii="Arial" w:hAnsi="Arial"/>
-                <w:b/>
-                <w:sz w:val="19"/>
-              </w:rPr>
-              <w:t xml:space="preserve">: </w:t>
-            </w:r>
-            <w:r>
-              <w:rPr>
-                <w:rFonts w:ascii="Arial" w:hAnsi="Arial"/>
-                <w:b/>
-                <w:sz w:val="19"/>
-                <w:u w:val="single"/>
-              </w:rPr>
-              <w:t xml:space="preserve"> {</w:t>
-            </w:r>
-            <w:proofErr w:type="gramEnd"/>
-            <w:r>
-              <w:rPr>
-                <w:rFonts w:ascii="Arial" w:hAnsi="Arial"/>
-                <w:b/>
-                <w:sz w:val="19"/>
-                <w:u w:val="single"/>
-              </w:rPr>
-              <w:t>{CELULAR1}}</w:t>
-            </w:r>
-            <w:r>
-              <w:rPr>
-                <w:rFonts w:ascii="Arial" w:hAnsi="Arial"/>
-                <w:b/>
-                <w:sz w:val="19"/>
-                <w:u w:val="single"/>
-              </w:rPr>
-              <w:tab/>
-            </w:r>
-            <w:r>
-              <w:rPr>
-                <w:rFonts w:ascii="Arial" w:hAnsi="Arial"/>
-                <w:b/>
-                <w:sz w:val="19"/>
-              </w:rPr>
-              <w:t xml:space="preserve"> Celular 2</w:t>
-            </w:r>
-            <w:proofErr w:type="gramStart"/>
-            <w:r>
-              <w:rPr>
-                <w:rFonts w:ascii="Arial" w:hAnsi="Arial"/>
-                <w:b/>
-                <w:sz w:val="19"/>
-              </w:rPr>
-              <w:t xml:space="preserve">: </w:t>
-            </w:r>
-            <w:r>
-              <w:rPr>
-                <w:rFonts w:ascii="Arial" w:hAnsi="Arial"/>
-                <w:b/>
-                <w:sz w:val="19"/>
-                <w:u w:val="single"/>
-              </w:rPr>
-              <w:t xml:space="preserve"> {</w:t>
-            </w:r>
-            <w:proofErr w:type="gramEnd"/>
-            <w:r>
-              <w:rPr>
-                <w:rFonts w:ascii="Arial" w:hAnsi="Arial"/>
-                <w:b/>
-                <w:sz w:val="19"/>
-                <w:u w:val="single"/>
-              </w:rPr>
-              <w:t>{CELULAR2}}</w:t>
-            </w:r>
-            <w:r>
-              <w:rPr>
-                <w:rFonts w:ascii="Arial" w:hAnsi="Arial"/>
-                <w:b/>
-                <w:sz w:val="19"/>
-                <w:u w:val="single"/>
-              </w:rPr>
-              <w:tab/>
-            </w:r>
-            <w:r>
-              <w:rPr>
-                <w:rFonts w:ascii="Arial" w:hAnsi="Arial"/>
-                <w:b/>
-                <w:sz w:val="19"/>
-                <w:u w:val="single"/>
-              </w:rPr>
-              <w:tab/>
-            </w:r>
-            <w:r>
-              <w:rPr>
-                <w:rFonts w:ascii="Arial" w:hAnsi="Arial"/>
-                <w:b/>
-                <w:sz w:val="19"/>
-              </w:rPr>
-              <w:t xml:space="preserve"> Importe de la separación</w:t>
-            </w:r>
-            <w:proofErr w:type="gramStart"/>
-            <w:r>
-              <w:rPr>
-                <w:rFonts w:ascii="Arial" w:hAnsi="Arial"/>
-                <w:b/>
-                <w:sz w:val="19"/>
-              </w:rPr>
-              <w:t xml:space="preserve">: </w:t>
-            </w:r>
-            <w:r>
-              <w:rPr>
-                <w:sz w:val="19"/>
-                <w:u w:val="single"/>
-              </w:rPr>
-              <w:t xml:space="preserve"> {</w:t>
-            </w:r>
-            <w:proofErr w:type="gramEnd"/>
-            <w:r>
-              <w:rPr>
-                <w:sz w:val="19"/>
-                <w:u w:val="single"/>
-              </w:rPr>
-              <w:t>{IMPORTE_LETRAS}}</w:t>
+              <w:t xml:space="preserve"> {{IMPORTE_LETRAS}}</w:t>
             </w:r>
             <w:r>
               <w:rPr>
@@ -1151,6 +1008,72 @@
             </w:r>
             <w:r>
               <w:rPr>
+                <w:spacing w:val="-2"/>
+                <w:w w:val="99"/>
+                <w:sz w:val="19"/>
+                <w:u w:val="single"/>
+              </w:rPr>
+            </w:r>
+            <w:r>
+              <w:rPr>
+                <w:w w:val="99"/>
+                <w:sz w:val="19"/>
+                <w:u w:val="single"/>
+              </w:rPr>
+            </w:r>
+            <w:r>
+              <w:rPr>
+                <w:spacing w:val="-1"/>
+                <w:sz w:val="19"/>
+                <w:u w:val="single"/>
+              </w:rPr>
+            </w:r>
+            <w:r>
+              <w:rPr>
+                <w:w w:val="99"/>
+                <w:sz w:val="19"/>
+                <w:u w:val="single"/>
+              </w:rPr>
+            </w:r>
+            <w:r>
+              <w:rPr>
+                <w:sz w:val="19"/>
+                <w:u w:val="single"/>
+              </w:rPr>
+            </w:r>
+            <w:r>
+              <w:rPr>
+                <w:spacing w:val="2"/>
+                <w:w w:val="99"/>
+                <w:sz w:val="19"/>
+                <w:u w:val="single"/>
+              </w:rPr>
+            </w:r>
+            <w:r>
+              <w:rPr>
+                <w:spacing w:val="-2"/>
+                <w:w w:val="99"/>
+                <w:sz w:val="19"/>
+                <w:u w:val="single"/>
+              </w:rPr>
+            </w:r>
+            <w:r>
+              <w:rPr>
+                <w:spacing w:val="-1"/>
+                <w:w w:val="99"/>
+                <w:sz w:val="19"/>
+                <w:u w:val="single"/>
+              </w:rPr>
+            </w:r>
+            <w:r>
+              <w:rPr>
+                <w:w w:val="99"/>
+                <w:sz w:val="19"/>
+                <w:u w:val="single"/>
+              </w:rPr>
+            </w:r>
+            <w:r>
+              <w:rPr>
                 <w:sz w:val="19"/>
                 <w:u w:val="single"/>
               </w:rPr>
@@ -1165,7 +1088,7 @@
         </w:trPr>
         <w:tc>
           <w:tcPr>
-            <w:tcW w:w="2676" w:type="dxa"/>
+            <w:tcW w:w="2268" w:type="dxa"/>
           </w:tcPr>
           <w:p>
             <w:pPr>
@@ -1199,25 +1122,7 @@
                 <w:b/>
                 <w:sz w:val="20"/>
               </w:rPr>
-              <w:t xml:space="preserve">Registral </w:t>
-            </w:r>
-            <w:proofErr w:type="spellStart"/>
-            <w:r>
-              <w:rPr>
-                <w:rFonts w:ascii="Arial" w:hAnsi="Arial"/>
-                <w:b/>
-                <w:sz w:val="20"/>
-              </w:rPr>
-              <w:t>N°</w:t>
-            </w:r>
-            <w:proofErr w:type="spellEnd"/>
-            <w:r>
-              <w:rPr>
-                <w:rFonts w:ascii="Arial" w:hAnsi="Arial"/>
-                <w:b/>
-                <w:sz w:val="20"/>
-              </w:rPr>
-              <w:t xml:space="preserve"> </w:t>
+              <w:t xml:space="preserve">Registral N° </w:t>
             </w:r>
             <w:r>
               <w:rPr>
@@ -1270,11 +1175,34 @@
               </w:rPr>
               <w:t>{{PROYECTO}}</w:t>
             </w:r>
+            <w:r>
+              <w:rPr>
+                <w:rFonts w:ascii="Arial" w:hAnsi="Arial"/>
+                <w:b/>
+                <w:spacing w:val="-12"/>
+                <w:sz w:val="20"/>
+              </w:rPr>
+            </w:r>
+            <w:r>
+              <w:rPr>
+                <w:rFonts w:ascii="Arial" w:hAnsi="Arial"/>
+                <w:b/>
+                <w:spacing w:val="-2"/>
+                <w:sz w:val="20"/>
+              </w:rPr>
+            </w:r>
+            <w:r>
+              <w:rPr>
+                <w:rFonts w:ascii="Arial" w:hAnsi="Arial"/>
+                <w:b/>
+                <w:sz w:val="20"/>
+              </w:rPr>
+            </w:r>
           </w:p>
         </w:tc>
         <w:tc>
           <w:tcPr>
-            <w:tcW w:w="3701" w:type="dxa"/>
+            <w:tcW w:w="3486" w:type="dxa"/>
           </w:tcPr>
           <w:p>
             <w:pPr>
@@ -1445,7 +1373,7 @@
         </w:trPr>
         <w:tc>
           <w:tcPr>
-            <w:tcW w:w="2676" w:type="dxa"/>
+            <w:tcW w:w="2268" w:type="dxa"/>
           </w:tcPr>
           <w:p>
             <w:pPr>
@@ -1475,34 +1403,45 @@
               </w:rPr>
               <w:t xml:space="preserve"> </w:t>
             </w:r>
-            <w:proofErr w:type="gramStart"/>
-            <w:r>
-              <w:rPr>
-                <w:rFonts w:ascii="Arial" w:hAnsi="Arial"/>
-                <w:b/>
-                <w:sz w:val="20"/>
-              </w:rPr>
-              <w:t>“ {</w:t>
-            </w:r>
-            <w:proofErr w:type="gramEnd"/>
-            <w:r>
-              <w:rPr>
-                <w:rFonts w:ascii="Arial" w:hAnsi="Arial"/>
-                <w:b/>
-                <w:sz w:val="20"/>
-              </w:rPr>
-              <w:t>{MANZANA}</w:t>
-            </w:r>
-            <w:proofErr w:type="gramStart"/>
-            <w:r>
-              <w:rPr>
-                <w:rFonts w:ascii="Arial" w:hAnsi="Arial"/>
-                <w:b/>
-                <w:sz w:val="20"/>
-              </w:rPr>
-              <w:t>} ”</w:t>
-            </w:r>
-            <w:proofErr w:type="gramEnd"/>
+            <w:r>
+              <w:rPr>
+                <w:rFonts w:ascii="Arial" w:hAnsi="Arial"/>
+                <w:b/>
+                <w:sz w:val="20"/>
+              </w:rPr>
+              <w:t>“ {{MANZANA}} ”</w:t>
+            </w:r>
+            <w:r>
+              <w:rPr>
+                <w:rFonts w:ascii="Arial" w:hAnsi="Arial"/>
+                <w:b/>
+                <w:spacing w:val="-5"/>
+                <w:sz w:val="20"/>
+              </w:rPr>
+            </w:r>
+            <w:r>
+              <w:rPr>
+                <w:rFonts w:ascii="Arial" w:hAnsi="Arial"/>
+                <w:b/>
+                <w:sz w:val="20"/>
+              </w:rPr>
+            </w:r>
+            <w:r>
+              <w:rPr>
+                <w:rFonts w:ascii="Arial" w:hAnsi="Arial"/>
+                <w:b/>
+                <w:spacing w:val="-6"/>
+                <w:sz w:val="20"/>
+              </w:rPr>
+            </w:r>
+            <w:r>
+              <w:rPr>
+                <w:rFonts w:ascii="Arial" w:hAnsi="Arial"/>
+                <w:b/>
+                <w:spacing w:val="-10"/>
+                <w:sz w:val="20"/>
+              </w:rPr>
+            </w:r>
           </w:p>
         </w:tc>
         <w:tc>
@@ -1538,23 +1477,13 @@
               </w:rPr>
               <w:t xml:space="preserve"> </w:t>
             </w:r>
-            <w:proofErr w:type="spellStart"/>
-            <w:r>
-              <w:rPr>
-                <w:rFonts w:ascii="Arial" w:hAnsi="Arial"/>
-                <w:b/>
-                <w:sz w:val="20"/>
-              </w:rPr>
-              <w:t>N°</w:t>
-            </w:r>
-            <w:proofErr w:type="spellEnd"/>
-            <w:r>
-              <w:rPr>
-                <w:rFonts w:ascii="Arial" w:hAnsi="Arial"/>
-                <w:b/>
-                <w:sz w:val="20"/>
-              </w:rPr>
-              <w:t>:</w:t>
+            <w:r>
+              <w:rPr>
+                <w:rFonts w:ascii="Arial" w:hAnsi="Arial"/>
+                <w:b/>
+                <w:sz w:val="20"/>
+              </w:rPr>
+              <w:t>N°:</w:t>
             </w:r>
             <w:r>
               <w:rPr>
@@ -1578,7 +1507,7 @@
         </w:tc>
         <w:tc>
           <w:tcPr>
-            <w:tcW w:w="3701" w:type="dxa"/>
+            <w:tcW w:w="3486" w:type="dxa"/>
           </w:tcPr>
           <w:p>
             <w:pPr>
@@ -1628,25 +1557,14 @@
               </w:rPr>
               <w:t xml:space="preserve"> </w:t>
             </w:r>
-            <w:proofErr w:type="spellStart"/>
-            <w:r>
-              <w:rPr>
-                <w:rFonts w:ascii="Arial" w:hAnsi="Arial"/>
-                <w:b/>
-                <w:spacing w:val="-2"/>
-                <w:sz w:val="20"/>
-              </w:rPr>
-              <w:t>aprox</w:t>
-            </w:r>
-            <w:proofErr w:type="spellEnd"/>
-            <w:r>
-              <w:rPr>
-                <w:rFonts w:ascii="Arial" w:hAnsi="Arial"/>
-                <w:b/>
-                <w:spacing w:val="-2"/>
-                <w:sz w:val="20"/>
-              </w:rPr>
-              <w:t>:</w:t>
+            <w:r>
+              <w:rPr>
+                <w:rFonts w:ascii="Arial" w:hAnsi="Arial"/>
+                <w:b/>
+                <w:spacing w:val="-2"/>
+                <w:sz w:val="20"/>
+              </w:rPr>
+              <w:t>aprox:</w:t>
             </w:r>
             <w:r>
               <w:rPr>
@@ -1656,6 +1574,97 @@
               </w:rPr>
               <w:tab/>
               <w:t>{{AREA}} M2</w:t>
+            </w:r>
+            <w:r>
+              <w:rPr>
+                <w:rFonts w:ascii="Arial" w:hAnsi="Arial"/>
+                <w:b/>
+                <w:spacing w:val="-3"/>
+                <w:sz w:val="20"/>
+              </w:rPr>
+            </w:r>
+            <w:r>
+              <w:rPr>
+                <w:rFonts w:ascii="Arial" w:hAnsi="Arial"/>
+                <w:b/>
+                <w:sz w:val="20"/>
+              </w:rPr>
+            </w:r>
+            <w:r>
+              <w:rPr>
+                <w:rFonts w:ascii="Arial" w:hAnsi="Arial"/>
+                <w:b/>
+                <w:spacing w:val="-2"/>
+                <w:sz w:val="20"/>
+              </w:rPr>
+            </w:r>
+            <w:r>
+              <w:rPr>
+                <w:rFonts w:ascii="Arial" w:hAnsi="Arial"/>
+                <w:b/>
+                <w:sz w:val="20"/>
+              </w:rPr>
+            </w:r>
+            <w:r>
+              <w:rPr>
+                <w:rFonts w:ascii="Arial" w:hAnsi="Arial"/>
+                <w:b/>
+                <w:spacing w:val="-2"/>
+                <w:sz w:val="20"/>
+              </w:rPr>
+            </w:r>
+            <w:r>
+              <w:rPr>
+                <w:rFonts w:ascii="Arial" w:hAnsi="Arial"/>
+                <w:b/>
+                <w:sz w:val="20"/>
+              </w:rPr>
+            </w:r>
+            <w:r>
+              <w:rPr>
+                <w:rFonts w:ascii="Arial" w:hAnsi="Arial"/>
+                <w:b/>
+                <w:spacing w:val="-5"/>
+                <w:sz w:val="20"/>
+              </w:rPr>
+            </w:r>
+            <w:r>
+              <w:rPr>
+                <w:rFonts w:ascii="Arial" w:hAnsi="Arial"/>
+                <w:b/>
+                <w:sz w:val="20"/>
+              </w:rPr>
+            </w:r>
+            <w:r>
+              <w:rPr>
+                <w:rFonts w:ascii="Arial" w:hAnsi="Arial"/>
+                <w:b/>
+                <w:spacing w:val="-2"/>
+                <w:sz w:val="20"/>
+              </w:rPr>
+            </w:r>
+            <w:r>
+              <w:rPr>
+                <w:rFonts w:ascii="Arial" w:hAnsi="Arial"/>
+                <w:b/>
+                <w:sz w:val="20"/>
+              </w:rPr>
+            </w:r>
+            <w:r>
+              <w:rPr>
+                <w:rFonts w:ascii="Arial" w:hAnsi="Arial"/>
+                <w:b/>
+                <w:spacing w:val="-1"/>
+                <w:sz w:val="20"/>
+              </w:rPr>
+            </w:r>
+            <w:r>
+              <w:rPr>
+                <w:rFonts w:ascii="Arial" w:hAnsi="Arial"/>
+                <w:b/>
+                <w:spacing w:val="22"/>
+                <w:sz w:val="20"/>
+              </w:rPr>
             </w:r>
           </w:p>
         </w:tc>
@@ -1666,7 +1675,7 @@
         </w:trPr>
         <w:tc>
           <w:tcPr>
-            <w:tcW w:w="10065" w:type="dxa"/>
+            <w:tcW w:w="9442" w:type="dxa"/>
             <w:gridSpan w:val="4"/>
           </w:tcPr>
           <w:p>
@@ -1686,33 +1695,7 @@
                 <w:b/>
                 <w:sz w:val="28"/>
               </w:rPr>
-              <w:t>{{ETIQUETA_FECHA}}</w:t>
-            </w:r>
-            <w:r>
-              <w:rPr>
-                <w:rFonts w:ascii="Arial" w:hAnsi="Arial"/>
-                <w:b/>
-                <w:sz w:val="28"/>
-              </w:rPr>
-              <w:t>:</w:t>
-            </w:r>
-            <w:r>
-              <w:rPr>
-                <w:rFonts w:ascii="Arial" w:hAnsi="Arial"/>
-                <w:b/>
-                <w:spacing w:val="53"/>
-                <w:w w:val="150"/>
-                <w:sz w:val="28"/>
-              </w:rPr>
-              <w:t xml:space="preserve"> </w:t>
-            </w:r>
-            <w:r>
-              <w:rPr>
-                <w:rFonts w:ascii="Arial" w:hAnsi="Arial"/>
-                <w:b/>
-                <w:sz w:val="28"/>
-              </w:rPr>
-              <w:t>{{FECHA_LIMITE}}</w:t>
+              <w:t xml:space="preserve">{{ETIQUETA_FECHA}}: {{FECHA_LIMITE}}</w:t>
             </w:r>
           </w:p>
         </w:tc>
@@ -1723,7 +1706,7 @@
         </w:trPr>
         <w:tc>
           <w:tcPr>
-            <w:tcW w:w="4748" w:type="dxa"/>
+            <w:tcW w:w="4340" w:type="dxa"/>
             <w:gridSpan w:val="2"/>
           </w:tcPr>
           <w:p>
@@ -1750,7 +1733,7 @@
         </w:tc>
         <w:tc>
           <w:tcPr>
-            <w:tcW w:w="5317" w:type="dxa"/>
+            <w:tcW w:w="5102" w:type="dxa"/>
             <w:gridSpan w:val="2"/>
           </w:tcPr>
           <w:p>
@@ -1814,17 +1797,17 @@
       </w:tr>
       <w:tr>
         <w:trPr>
-          <w:trHeight w:val="6035"/>
+          <w:trHeight w:val="5200"/>
         </w:trPr>
         <w:tc>
           <w:tcPr>
-            <w:tcW w:w="4748" w:type="dxa"/>
+            <w:tcW w:w="4340" w:type="dxa"/>
             <w:gridSpan w:val="2"/>
           </w:tcPr>
           <w:p>
             <w:pPr>
               <w:pStyle w:val="TableParagraph"/>
-              <w:spacing w:before="3"/>
+              <w:spacing w:before="0" w:after="0" w:line="130" w:lineRule="exact"/>
               <w:ind w:left="0"/>
               <w:rPr>
                 <w:rFonts w:ascii="Times New Roman"/>
@@ -2161,7 +2144,7 @@
           <w:p>
             <w:pPr>
               <w:pStyle w:val="TableParagraph"/>
-              <w:spacing w:before="172"/>
+              <w:spacing w:before="100"/>
               <w:ind w:right="120"/>
               <w:jc w:val="both"/>
               <w:rPr>
@@ -2311,7 +2294,7 @@
           <w:p>
             <w:pPr>
               <w:pStyle w:val="TableParagraph"/>
-              <w:spacing w:before="167"/>
+              <w:spacing w:before="100"/>
               <w:ind w:right="119"/>
               <w:jc w:val="both"/>
               <w:rPr>
@@ -2458,7 +2441,7 @@
           <w:p>
             <w:pPr>
               <w:pStyle w:val="TableParagraph"/>
-              <w:spacing w:before="1"/>
+              <w:spacing w:before="0" w:after="0" w:line="130" w:lineRule="exact"/>
               <w:ind w:left="0"/>
               <w:rPr>
                 <w:rFonts w:ascii="Times New Roman"/>
@@ -2498,6 +2481,7 @@
           <w:p>
             <w:pPr>
               <w:pStyle w:val="TableParagraph"/>
+              <w:spacing w:before="0" w:after="0" w:line="130" w:lineRule="exact"/>
               <w:ind w:left="0"/>
               <w:rPr>
                 <w:rFonts w:ascii="Times New Roman"/>
@@ -2589,7 +2573,7 @@
           <w:p>
             <w:pPr>
               <w:pStyle w:val="TableParagraph"/>
-              <w:spacing w:before="170"/>
+              <w:spacing w:before="100"/>
               <w:ind w:right="120"/>
               <w:jc w:val="both"/>
               <w:rPr>
@@ -2671,7 +2655,7 @@
           <w:p>
             <w:pPr>
               <w:pStyle w:val="TableParagraph"/>
-              <w:spacing w:before="169"/>
+              <w:spacing w:before="100"/>
               <w:ind w:right="120"/>
               <w:jc w:val="both"/>
               <w:rPr>
@@ -2701,13 +2685,13 @@
         </w:tc>
         <w:tc>
           <w:tcPr>
-            <w:tcW w:w="5317" w:type="dxa"/>
+            <w:tcW w:w="5102" w:type="dxa"/>
             <w:gridSpan w:val="2"/>
           </w:tcPr>
           <w:p>
             <w:pPr>
               <w:pStyle w:val="TableParagraph"/>
-              <w:spacing w:before="9"/>
+              <w:spacing w:before="0" w:after="0" w:line="130" w:lineRule="exact"/>
               <w:ind w:left="0"/>
               <w:rPr>
                 <w:rFonts w:ascii="Times New Roman"/>
@@ -2747,6 +2731,7 @@
           <w:p>
             <w:pPr>
               <w:pStyle w:val="TableParagraph"/>
+              <w:spacing w:before="0" w:after="0" w:line="130" w:lineRule="exact"/>
               <w:ind w:left="0"/>
               <w:rPr>
                 <w:rFonts w:ascii="Times New Roman"/>
@@ -2903,7 +2888,7 @@
           <w:p>
             <w:pPr>
               <w:pStyle w:val="TableParagraph"/>
-              <w:spacing w:before="166"/>
+              <w:spacing w:before="100"/>
               <w:ind w:left="136" w:right="195"/>
               <w:jc w:val="both"/>
               <w:rPr>
@@ -3009,7 +2994,7 @@
           <w:p>
             <w:pPr>
               <w:pStyle w:val="TableParagraph"/>
-              <w:spacing w:before="172"/>
+              <w:spacing w:before="100"/>
               <w:ind w:left="136" w:right="195"/>
               <w:jc w:val="both"/>
               <w:rPr>
@@ -3046,7 +3031,7 @@
           <w:p>
             <w:pPr>
               <w:pStyle w:val="TableParagraph"/>
-              <w:spacing w:before="171"/>
+              <w:spacing w:before="100"/>
               <w:ind w:left="136" w:right="198"/>
               <w:jc w:val="both"/>
               <w:rPr>
@@ -3202,7 +3187,7 @@
           <w:p>
             <w:pPr>
               <w:pStyle w:val="TableParagraph"/>
-              <w:spacing w:before="169"/>
+              <w:spacing w:before="100"/>
               <w:ind w:left="136" w:right="203"/>
               <w:jc w:val="both"/>
               <w:rPr>
@@ -3375,7 +3360,7 @@
           <w:p>
             <w:pPr>
               <w:pStyle w:val="TableParagraph"/>
-              <w:spacing w:before="169"/>
+              <w:spacing w:before="100"/>
               <w:ind w:left="136" w:right="196"/>
               <w:jc w:val="both"/>
               <w:rPr>
@@ -3407,6 +3392,8 @@
     <w:p>
       <w:pPr>
         <w:pStyle w:val="Textoindependiente"/>
+        <w:keepNext/>
+        <w:spacing w:before="0" w:after="0" w:line="200" w:lineRule="exact"/>
         <w:rPr>
           <w:rFonts w:ascii="Times New Roman"/>
           <w:sz w:val="20"/>
@@ -3416,6 +3403,8 @@
     <w:p>
       <w:pPr>
         <w:pStyle w:val="Textoindependiente"/>
+        <w:keepNext/>
+        <w:spacing w:before="0" w:after="0" w:line="200" w:lineRule="exact"/>
         <w:rPr>
           <w:rFonts w:ascii="Times New Roman"/>
           <w:sz w:val="20"/>
@@ -3425,6 +3414,8 @@
     <w:p>
       <w:pPr>
         <w:pStyle w:val="Textoindependiente"/>
+        <w:keepNext/>
+        <w:spacing w:before="0" w:after="0" w:line="200" w:lineRule="exact"/>
         <w:rPr>
           <w:rFonts w:ascii="Times New Roman"/>
           <w:sz w:val="20"/>
@@ -3434,6 +3425,8 @@
     <w:p>
       <w:pPr>
         <w:pStyle w:val="Textoindependiente"/>
+        <w:keepNext/>
+        <w:spacing w:before="0" w:after="0" w:line="200" w:lineRule="exact"/>
         <w:rPr>
           <w:rFonts w:ascii="Times New Roman"/>
           <w:sz w:val="20"/>
@@ -3443,6 +3436,8 @@
     <w:p>
       <w:pPr>
         <w:pStyle w:val="Textoindependiente"/>
+        <w:keepNext/>
+        <w:spacing w:before="0" w:after="0" w:line="200" w:lineRule="exact"/>
         <w:rPr>
           <w:rFonts w:ascii="Times New Roman"/>
           <w:sz w:val="20"/>
@@ -3451,16 +3446,8 @@
     </w:p>
     <w:p>
       <w:pPr>
-        <w:pStyle w:val="Textoindependiente"/>
-        <w:spacing w:before="164"/>
-        <w:rPr>
-          <w:rFonts w:ascii="Times New Roman"/>
-          <w:sz w:val="20"/>
-        </w:rPr>
-      </w:pPr>
-    </w:p>
-    <w:p>
-      <w:pPr>
+        <w:keepNext/>
+        <w:keepLines/>
         <w:tabs>
           <w:tab w:val="left" w:pos="5765"/>
         </w:tabs>
@@ -3477,13 +3464,13 @@
           <w:sz w:val="20"/>
         </w:rPr>
         <w:drawing>
-          <wp:anchor distT="0" distB="0" distL="0" distR="0" simplePos="0" relativeHeight="15729152" behindDoc="0" locked="0" layoutInCell="1" allowOverlap="1" wp14:anchorId="539B934B" wp14:editId="126E7579">
+          <wp:anchor distT="0" distB="0" distL="0" distR="0" simplePos="0" relativeHeight="15729152" behindDoc="1" locked="0" layoutInCell="1" allowOverlap="1" wp14:anchorId="539B934B" wp14:editId="126E7579">
             <wp:simplePos x="0" y="0"/>
             <wp:positionH relativeFrom="page">
               <wp:posOffset>4830445</wp:posOffset>
             </wp:positionH>
             <wp:positionV relativeFrom="paragraph">
-              <wp:posOffset>-813233</wp:posOffset>
+              <wp:posOffset>-760000</wp:posOffset>
             </wp:positionV>
             <wp:extent cx="1440179" cy="910589"/>
             <wp:effectExtent l="0" t="0" r="0" b="0"/>
@@ -3551,31 +3538,33 @@
     </w:p>
     <w:p>
       <w:pPr>
+        <w:keepNext/>
+        <w:keepLines/>
         <w:tabs>
           <w:tab w:val="left" w:pos="6430"/>
         </w:tabs>
         <w:spacing w:before="94"/>
         <w:ind w:left="1924"/>
         <w:rPr>
-          <w:sz w:val="24"/>
+          <w:sz w:val="21"/>
         </w:rPr>
       </w:pPr>
       <w:r>
         <w:rPr>
-          <w:sz w:val="24"/>
+          <w:sz w:val="21"/>
         </w:rPr>
         <w:t xml:space="preserve">El </w:t>
       </w:r>
       <w:r>
         <w:rPr>
           <w:spacing w:val="-2"/>
-          <w:sz w:val="24"/>
+          <w:sz w:val="21"/>
         </w:rPr>
         <w:t>cliente</w:t>
       </w:r>
       <w:r>
         <w:rPr>
-          <w:sz w:val="24"/>
+          <w:sz w:val="21"/>
         </w:rPr>
         <w:tab/>
         <w:t>Ejecutivo</w:t>
@@ -3583,74 +3572,75 @@
       <w:r>
         <w:rPr>
           <w:spacing w:val="-4"/>
-          <w:sz w:val="24"/>
+          <w:sz w:val="21"/>
         </w:rPr>
         <w:t xml:space="preserve"> </w:t>
       </w:r>
       <w:r>
         <w:rPr>
-          <w:sz w:val="24"/>
+          <w:sz w:val="21"/>
         </w:rPr>
         <w:t>de</w:t>
       </w:r>
       <w:r>
         <w:rPr>
           <w:spacing w:val="-3"/>
-          <w:sz w:val="24"/>
+          <w:sz w:val="21"/>
         </w:rPr>
         <w:t xml:space="preserve"> </w:t>
       </w:r>
       <w:r>
         <w:rPr>
           <w:spacing w:val="-2"/>
-          <w:sz w:val="24"/>
+          <w:sz w:val="21"/>
         </w:rPr>
         <w:t>Ventas</w:t>
       </w:r>
     </w:p>
     <w:p>
       <w:pPr>
+        <w:keepLines/>
         <w:ind w:left="5974"/>
         <w:rPr>
-          <w:sz w:val="24"/>
+          <w:sz w:val="21"/>
         </w:rPr>
       </w:pPr>
       <w:r>
         <w:rPr>
-          <w:sz w:val="24"/>
+          <w:sz w:val="21"/>
         </w:rPr>
         <w:t>Jociney</w:t>
       </w:r>
       <w:r>
         <w:rPr>
           <w:spacing w:val="-3"/>
-          <w:sz w:val="24"/>
+          <w:sz w:val="21"/>
         </w:rPr>
         <w:t xml:space="preserve"> </w:t>
       </w:r>
       <w:r>
         <w:rPr>
-          <w:sz w:val="24"/>
+          <w:sz w:val="21"/>
         </w:rPr>
         <w:t>S.</w:t>
       </w:r>
       <w:r>
         <w:rPr>
           <w:spacing w:val="-5"/>
-          <w:sz w:val="24"/>
+          <w:sz w:val="21"/>
         </w:rPr>
         <w:t xml:space="preserve"> </w:t>
       </w:r>
       <w:r>
         <w:rPr>
-          <w:sz w:val="24"/>
+          <w:sz w:val="21"/>
         </w:rPr>
         <w:t>Vilchez</w:t>
       </w:r>
       <w:r>
         <w:rPr>
           <w:spacing w:val="-2"/>
-          <w:sz w:val="24"/>
+          <w:sz w:val="21"/>
         </w:rPr>
         <w:t xml:space="preserve"> Morales</w:t>
       </w:r>
@@ -3659,7 +3649,7 @@
       <w:footerReference w:type="default" r:id="rId9"/>
       <w:type w:val="continuous"/>
       <w:pgSz w:w="11920" w:h="16850"/>
-      <w:pgMar w:top="980" w:right="992" w:bottom="1100" w:left="1275" w:header="0" w:footer="908" w:gutter="0"/>
+      <w:pgMar w:top="700" w:right="992" w:bottom="1250" w:left="1275" w:header="0" w:footer="420" w:gutter="0"/>
       <w:pgNumType w:start="1"/>
       <w:cols w:space="720"/>
     </w:sectPr>
@@ -3668,7 +3658,7 @@
 </file>
 
 <file path=word/endnotes.xml><?xml version="1.0" encoding="utf-8"?>
-<w:endnotes xmlns:wpc="http://schemas.microsoft.com/office/word/2010/wordprocessingCanvas" xmlns:cx="http://schemas.microsoft.com/office/drawing/2014/chartex" xmlns:cx1="http://schemas.microsoft.com/office/drawing/2015/9/8/chartex" xmlns:cx2="http://schemas.microsoft.com/office/drawing/2015/10/21/chartex" xmlns:cx3="http://schemas.microsoft.com/office/drawing/2016/5/9/chartex" xmlns:cx4="http://schemas.microsoft.com/office/drawing/2016/5/10/chartex" xmlns:cx5="http://schemas.microsoft.com/office/drawing/2016/5/11/chartex" xmlns:cx6="http://schemas.microsoft.com/office/drawing/2016/5/12/chartex" xmlns:cx7="http://schemas.microsoft.com/office/drawing/2016/5/13/chartex" xmlns:cx8="http://schemas.microsoft.com/office/drawing/2016/5/14/chartex" xmlns:mc="http://schemas.openxmlformats.org/markup-compatibility/2006" xmlns:aink="http://schemas.microsoft.com/office/drawing/2016/ink" xmlns:am3d="http://schemas.microsoft.com/office/drawing/2017/model3d" xmlns:o="urn:schemas-microsoft-com:office:office" xmlns:oel="http://schemas.microsoft.com/office/2019/extlst" xmlns:r="http://schemas.openxmlformats.org/officeDocument/2006/relationships" xmlns:m="http://schemas.openxmlformats.org/officeDocument/2006/math" xmlns:v="urn:schemas-microsoft-com:vml" xmlns:wp14="http://schemas.microsoft.com/office/word/2010/wordprocessingDrawing" xmlns:wp="http://schemas.openxmlformats.org/drawingml/2006/wordprocessingDrawing" xmlns:w10="urn:schemas-microsoft-com:office:word" xmlns:w="http://schemas.openxmlformats.org/wordprocessingml/2006/main" xmlns:w14="http://schemas.microsoft.com/office/word/2010/wordml" xmlns:w15="http://schemas.microsoft.com/office/word/2012/wordml" xmlns:w16cex="http://schemas.microsoft.com/office/word/2018/wordml/cex" xmlns:w16cid="http://schemas.microsoft.com/office/word/2016/wordml/cid" xmlns:w16="http://schemas.microsoft.com/office/word/2018/wordml" xmlns:w16du="http://schemas.microsoft.com/office/word/2023/wordml/word16du" xmlns:w16sdtdh="http://schemas.microsoft.com/office/word/2020/wordml/sdtdatahash" xmlns:w16sdtfl="http://schemas.microsoft.com/office/word/2024/wordml/sdtformatlock" xmlns:w16se="http://schemas.microsoft.com/office/word/2015/wordml/symex" xmlns:wpg="http://schemas.microsoft.com/office/word/2010/wordprocessingGroup" xmlns:wpi="http://schemas.microsoft.com/office/word/2010/wordprocessingInk" xmlns:wne="http://schemas.microsoft.com/office/word/2006/wordml" xmlns:wps="http://schemas.microsoft.com/office/word/2010/wordprocessingShape" mc:Ignorable="w14 w15 w16se w16cid w16 w16cex w16sdtdh w16sdtfl w16du wp14">
+<w:endnotes xmlns:wpc="http://schemas.microsoft.com/office/word/2010/wordprocessingCanvas" xmlns:cx="http://schemas.microsoft.com/office/drawing/2014/chartex" xmlns:cx1="http://schemas.microsoft.com/office/drawing/2015/9/8/chartex" xmlns:cx2="http://schemas.microsoft.com/office/drawing/2015/10/21/chartex" xmlns:cx3="http://schemas.microsoft.com/office/drawing/2016/5/9/chartex" xmlns:cx4="http://schemas.microsoft.com/office/drawing/2016/5/10/chartex" xmlns:cx5="http://schemas.microsoft.com/office/drawing/2016/5/11/chartex" xmlns:cx6="http://schemas.microsoft.com/office/drawing/2016/5/12/chartex" xmlns:cx7="http://schemas.microsoft.com/office/drawing/2016/5/13/chartex" xmlns:cx8="http://schemas.microsoft.com/office/drawing/2016/5/14/chartex" xmlns:mc="http://schemas.openxmlformats.org/markup-compatibility/2006" xmlns:aink="http://schemas.microsoft.com/office/drawing/2016/ink" xmlns:am3d="http://schemas.microsoft.com/office/drawing/2017/model3d" xmlns:o="urn:schemas-microsoft-com:office:office" xmlns:oel="http://schemas.microsoft.com/office/2019/extlst" xmlns:r="http://schemas.openxmlformats.org/officeDocument/2006/relationships" xmlns:m="http://schemas.openxmlformats.org/officeDocument/2006/math" xmlns:v="urn:schemas-microsoft-com:vml" xmlns:wp14="http://schemas.microsoft.com/office/word/2010/wordprocessingDrawing" xmlns:wp="http://schemas.openxmlformats.org/drawingml/2006/wordprocessingDrawing" xmlns:w10="urn:schemas-microsoft-com:office:word" xmlns:w="http://schemas.openxmlformats.org/wordprocessingml/2006/main" xmlns:w14="http://schemas.microsoft.com/office/word/2010/wordml" xmlns:w15="http://schemas.microsoft.com/office/word/2012/wordml" xmlns:w16cex="http://schemas.microsoft.com/office/word/2018/wordml/cex" xmlns:w16cid="http://schemas.microsoft.com/office/word/2016/wordml/cid" xmlns:w16="http://schemas.microsoft.com/office/word/2018/wordml" xmlns:w16du="http://schemas.microsoft.com/office/word/2023/wordml/word16du" xmlns:w16sdtdh="http://schemas.microsoft.com/office/word/2020/wordml/sdtdatahash" xmlns:w16se="http://schemas.microsoft.com/office/word/2015/wordml/symex" xmlns:wpg="http://schemas.microsoft.com/office/word/2010/wordprocessingGroup" xmlns:wpi="http://schemas.microsoft.com/office/word/2010/wordprocessingInk" xmlns:wne="http://schemas.microsoft.com/office/word/2006/wordml" xmlns:wps="http://schemas.microsoft.com/office/word/2010/wordprocessingShape" mc:Ignorable="w14 w15 w16se w16cid w16 w16cex w16sdtdh w16du wp14">
   <w:endnote w:type="separator" w:id="-1">
     <w:p>
       <w:r>
@@ -3687,493 +3677,65 @@
 </file>
 
 <file path=word/footer1.xml><?xml version="1.0" encoding="utf-8"?>
-<w:ftr xmlns:wpc="http://schemas.microsoft.com/office/word/2010/wordprocessingCanvas" xmlns:cx="http://schemas.microsoft.com/office/drawing/2014/chartex" xmlns:cx1="http://schemas.microsoft.com/office/drawing/2015/9/8/chartex" xmlns:cx2="http://schemas.microsoft.com/office/drawing/2015/10/21/chartex" xmlns:cx3="http://schemas.microsoft.com/office/drawing/2016/5/9/chartex" xmlns:cx4="http://schemas.microsoft.com/office/drawing/2016/5/10/chartex" xmlns:cx5="http://schemas.microsoft.com/office/drawing/2016/5/11/chartex" xmlns:cx6="http://schemas.microsoft.com/office/drawing/2016/5/12/chartex" xmlns:cx7="http://schemas.microsoft.com/office/drawing/2016/5/13/chartex" xmlns:cx8="http://schemas.microsoft.com/office/drawing/2016/5/14/chartex" xmlns:mc="http://schemas.openxmlformats.org/markup-compatibility/2006" xmlns:aink="http://schemas.microsoft.com/office/drawing/2016/ink" xmlns:am3d="http://schemas.microsoft.com/office/drawing/2017/model3d" xmlns:o="urn:schemas-microsoft-com:office:office" xmlns:oel="http://schemas.microsoft.com/office/2019/extlst" xmlns:r="http://schemas.openxmlformats.org/officeDocument/2006/relationships" xmlns:m="http://schemas.openxmlformats.org/officeDocument/2006/math" xmlns:v="urn:schemas-microsoft-com:vml" xmlns:wp14="http://schemas.microsoft.com/office/word/2010/wordprocessingDrawing" xmlns:wp="http://schemas.openxmlformats.org/drawingml/2006/wordprocessingDrawing" xmlns:w10="urn:schemas-microsoft-com:office:word" xmlns:w="http://schemas.openxmlformats.org/wordprocessingml/2006/main" xmlns:w14="http://schemas.microsoft.com/office/word/2010/wordml" xmlns:w15="http://schemas.microsoft.com/office/word/2012/wordml" xmlns:w16cex="http://schemas.microsoft.com/office/word/2018/wordml/cex" xmlns:w16cid="http://schemas.microsoft.com/office/word/2016/wordml/cid" xmlns:w16="http://schemas.microsoft.com/office/word/2018/wordml" xmlns:w16du="http://schemas.microsoft.com/office/word/2023/wordml/word16du" xmlns:w16sdtdh="http://schemas.microsoft.com/office/word/2020/wordml/sdtdatahash" xmlns:w16sdtfl="http://schemas.microsoft.com/office/word/2024/wordml/sdtformatlock" xmlns:w16se="http://schemas.microsoft.com/office/word/2015/wordml/symex" xmlns:wpg="http://schemas.microsoft.com/office/word/2010/wordprocessingGroup" xmlns:wpi="http://schemas.microsoft.com/office/word/2010/wordprocessingInk" xmlns:wne="http://schemas.microsoft.com/office/word/2006/wordml" xmlns:wps="http://schemas.microsoft.com/office/word/2010/wordprocessingShape" mc:Ignorable="w14 w15 w16se w16cid w16 w16cex w16sdtdh w16sdtfl w16du wp14">
+<w:ftr xmlns:wpc="http://schemas.microsoft.com/office/word/2010/wordprocessingCanvas" xmlns:cx="http://schemas.microsoft.com/office/drawing/2014/chartex" xmlns:cx1="http://schemas.microsoft.com/office/drawing/2015/9/8/chartex" xmlns:cx2="http://schemas.microsoft.com/office/drawing/2015/10/21/chartex" xmlns:cx3="http://schemas.microsoft.com/office/drawing/2016/5/9/chartex" xmlns:cx4="http://schemas.microsoft.com/office/drawing/2016/5/10/chartex" xmlns:cx5="http://schemas.microsoft.com/office/drawing/2016/5/11/chartex" xmlns:cx6="http://schemas.microsoft.com/office/drawing/2016/5/12/chartex" xmlns:cx7="http://schemas.microsoft.com/office/drawing/2016/5/13/chartex" xmlns:cx8="http://schemas.microsoft.com/office/drawing/2016/5/14/chartex" xmlns:mc="http://schemas.openxmlformats.org/markup-compatibility/2006" xmlns:aink="http://schemas.microsoft.com/office/drawing/2016/ink" xmlns:am3d="http://schemas.microsoft.com/office/drawing/2017/model3d" xmlns:o="urn:schemas-microsoft-com:office:office" xmlns:oel="http://schemas.microsoft.com/office/2019/extlst" xmlns:r="http://schemas.openxmlformats.org/officeDocument/2006/relationships" xmlns:m="http://schemas.openxmlformats.org/officeDocument/2006/math" xmlns:v="urn:schemas-microsoft-com:vml" xmlns:wp14="http://schemas.microsoft.com/office/word/2010/wordprocessingDrawing" xmlns:wp="http://schemas.openxmlformats.org/drawingml/2006/wordprocessingDrawing" xmlns:w10="urn:schemas-microsoft-com:office:word" xmlns:w="http://schemas.openxmlformats.org/wordprocessingml/2006/main" xmlns:w14="http://schemas.microsoft.com/office/word/2010/wordml" xmlns:w15="http://schemas.microsoft.com/office/word/2012/wordml" xmlns:w16cex="http://schemas.microsoft.com/office/word/2018/wordml/cex" xmlns:w16cid="http://schemas.microsoft.com/office/word/2016/wordml/cid" xmlns:w16="http://schemas.microsoft.com/office/word/2018/wordml" xmlns:w16du="http://schemas.microsoft.com/office/word/2023/wordml/word16du" xmlns:w16sdtdh="http://schemas.microsoft.com/office/word/2020/wordml/sdtdatahash" xmlns:w16se="http://schemas.microsoft.com/office/word/2015/wordml/symex" xmlns:wpg="http://schemas.microsoft.com/office/word/2010/wordprocessingGroup" xmlns:wpi="http://schemas.microsoft.com/office/word/2010/wordprocessingInk" xmlns:wne="http://schemas.microsoft.com/office/word/2006/wordml" xmlns:wps="http://schemas.microsoft.com/office/word/2010/wordprocessingShape" mc:Ignorable="w14 w15 w16se w16cid w16 w16cex w16sdtdh w16du wp14">
   <w:p>
     <w:pPr>
-      <w:pStyle w:val="Textoindependiente"/>
-      <w:spacing w:line="14" w:lineRule="auto"/>
-      <w:rPr>
-        <w:sz w:val="20"/>
-      </w:rPr>
+      <w:spacing w:before="0" w:after="0" w:line="220" w:lineRule="exact"/>
+      <w:jc w:val="center"/>
     </w:pPr>
     <w:r>
       <w:rPr>
-        <w:noProof/>
-        <w:sz w:val="20"/>
+        <w:rFonts w:ascii="Arial" w:hAnsi="Arial"/>
+        <w:b/>
+        <w:color w:val="30849B"/>
+        <w:sz w:val="17"/>
       </w:rPr>
-      <mc:AlternateContent>
-        <mc:Choice Requires="wps">
-          <w:drawing>
-            <wp:anchor distT="0" distB="0" distL="0" distR="0" simplePos="0" relativeHeight="487522816" behindDoc="1" locked="0" layoutInCell="1" allowOverlap="1" wp14:anchorId="631C8E53" wp14:editId="598CF113">
-              <wp:simplePos x="0" y="0"/>
-              <wp:positionH relativeFrom="page">
-                <wp:posOffset>2942970</wp:posOffset>
-              </wp:positionH>
-              <wp:positionV relativeFrom="page">
-                <wp:posOffset>9977328</wp:posOffset>
-              </wp:positionV>
-              <wp:extent cx="1423670" cy="283845"/>
-              <wp:effectExtent l="0" t="0" r="0" b="0"/>
-              <wp:wrapNone/>
-              <wp:docPr id="1" name="Textbox 1"/>
-              <wp:cNvGraphicFramePr>
-                <a:graphicFrameLocks xmlns:a="http://schemas.openxmlformats.org/drawingml/2006/main"/>
-              </wp:cNvGraphicFramePr>
-              <a:graphic xmlns:a="http://schemas.openxmlformats.org/drawingml/2006/main">
-                <a:graphicData uri="http://schemas.microsoft.com/office/word/2010/wordprocessingShape">
-                  <wps:wsp>
-                    <wps:cNvSpPr txBox="1">
-                      <a:spLocks/>
-                    </wps:cNvSpPr>
-                    <wps:spPr>
-                      <a:xfrm>
-                        <a:off x="0" y="0"/>
-                        <a:ext cx="1423670" cy="283845"/>
-                      </a:xfrm>
-                      <a:prstGeom prst="rect">
-                        <a:avLst/>
-                      </a:prstGeom>
-                    </wps:spPr>
-                    <wps:txbx>
-                      <w:txbxContent>
-                        <w:p>
-                          <w:pPr>
-                            <w:spacing w:before="20"/>
-                            <w:jc w:val="center"/>
-                            <w:rPr>
-                              <w:rFonts w:ascii="Cambria"/>
-                              <w:sz w:val="16"/>
-                            </w:rPr>
-                          </w:pPr>
-                          <w:r>
-                            <w:rPr>
-                              <w:rFonts w:ascii="Cambria"/>
-                              <w:color w:val="30849B"/>
-                              <w:sz w:val="16"/>
-                            </w:rPr>
-                            <w:t>GRUSELVA</w:t>
-                          </w:r>
-                          <w:r>
-                            <w:rPr>
-                              <w:rFonts w:ascii="Cambria"/>
-                              <w:color w:val="30849B"/>
-                              <w:spacing w:val="-8"/>
-                              <w:sz w:val="16"/>
-                            </w:rPr>
-                            <w:t xml:space="preserve"> </w:t>
-                          </w:r>
-                          <w:r>
-                            <w:rPr>
-                              <w:rFonts w:ascii="Cambria"/>
-                              <w:color w:val="30849B"/>
-                              <w:spacing w:val="-5"/>
-                              <w:sz w:val="16"/>
-                            </w:rPr>
-                            <w:t>SAC</w:t>
-                          </w:r>
-                        </w:p>
-                        <w:p>
-                          <w:pPr>
-                            <w:pStyle w:val="Textoindependiente"/>
-                            <w:spacing w:before="2"/>
-                            <w:jc w:val="center"/>
-                          </w:pPr>
-                          <w:r>
-                            <w:rPr>
-                              <w:color w:val="30849B"/>
-                            </w:rPr>
-                            <w:t>Jr.</w:t>
-                          </w:r>
-                          <w:r>
-                            <w:rPr>
-                              <w:color w:val="30849B"/>
-                              <w:spacing w:val="-3"/>
-                            </w:rPr>
-                            <w:t xml:space="preserve"> </w:t>
-                          </w:r>
-                          <w:r>
-                            <w:rPr>
-                              <w:color w:val="30849B"/>
-                            </w:rPr>
-                            <w:t>Las</w:t>
-                          </w:r>
-                          <w:r>
-                            <w:rPr>
-                              <w:color w:val="30849B"/>
-                              <w:spacing w:val="-2"/>
-                            </w:rPr>
-                            <w:t xml:space="preserve"> </w:t>
-                          </w:r>
-                          <w:r>
-                            <w:rPr>
-                              <w:color w:val="30849B"/>
-                            </w:rPr>
-                            <w:t>Malvinas</w:t>
-                          </w:r>
-                          <w:r>
-                            <w:rPr>
-                              <w:color w:val="30849B"/>
-                              <w:spacing w:val="-3"/>
-                            </w:rPr>
-                            <w:t xml:space="preserve"> </w:t>
-                          </w:r>
-                          <w:r>
-                            <w:rPr>
-                              <w:color w:val="30849B"/>
-                            </w:rPr>
-                            <w:t>S-N</w:t>
-                          </w:r>
-                          <w:r>
-                            <w:rPr>
-                              <w:color w:val="30849B"/>
-                              <w:spacing w:val="-2"/>
-                            </w:rPr>
-                            <w:t xml:space="preserve"> Mazamari</w:t>
-                          </w:r>
-                        </w:p>
-                      </w:txbxContent>
-                    </wps:txbx>
-                    <wps:bodyPr wrap="square" lIns="0" tIns="0" rIns="0" bIns="0" rtlCol="0">
-                      <a:noAutofit/>
-                    </wps:bodyPr>
-                  </wps:wsp>
-                </a:graphicData>
-              </a:graphic>
-            </wp:anchor>
-          </w:drawing>
-        </mc:Choice>
-        <mc:Fallback>
-          <w:pict>
-            <v:shapetype w14:anchorId="631C8E53" id="_x0000_t202" coordsize="21600,21600" o:spt="202" path="m,l,21600r21600,l21600,xe">
-              <v:stroke joinstyle="miter"/>
-              <v:path gradientshapeok="t" o:connecttype="rect"/>
-            </v:shapetype>
-            <v:shape id="Textbox 1" o:spid="_x0000_s1026" type="#_x0000_t202" style="position:absolute;margin-left:231.75pt;margin-top:785.6pt;width:112.1pt;height:22.35pt;z-index:-15793664;visibility:visible;mso-wrap-style:square;mso-wrap-distance-left:0;mso-wrap-distance-top:0;mso-wrap-distance-right:0;mso-wrap-distance-bottom:0;mso-position-horizontal:absolute;mso-position-horizontal-relative:page;mso-position-vertical:absolute;mso-position-vertical-relative:page;v-text-anchor:top" o:gfxdata="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" filled="f" stroked="f">
-              <v:textbox inset="0,0,0,0">
-                <w:txbxContent>
-                  <w:p>
-                    <w:pPr>
-                      <w:spacing w:before="20"/>
-                      <w:jc w:val="center"/>
-                      <w:rPr>
-                        <w:rFonts w:ascii="Cambria"/>
-                        <w:sz w:val="16"/>
-                      </w:rPr>
-                    </w:pPr>
-                    <w:r>
-                      <w:rPr>
-                        <w:rFonts w:ascii="Cambria"/>
-                        <w:color w:val="30849B"/>
-                        <w:sz w:val="16"/>
-                      </w:rPr>
-                      <w:t>GRUSELVA</w:t>
-                    </w:r>
-                    <w:r>
-                      <w:rPr>
-                        <w:rFonts w:ascii="Cambria"/>
-                        <w:color w:val="30849B"/>
-                        <w:spacing w:val="-8"/>
-                        <w:sz w:val="16"/>
-                      </w:rPr>
-                      <w:t xml:space="preserve"> </w:t>
-                    </w:r>
-                    <w:r>
-                      <w:rPr>
-                        <w:rFonts w:ascii="Cambria"/>
-                        <w:color w:val="30849B"/>
-                        <w:spacing w:val="-5"/>
-                        <w:sz w:val="16"/>
-                      </w:rPr>
-                      <w:t>SAC</w:t>
-                    </w:r>
-                  </w:p>
-                  <w:p>
-                    <w:pPr>
-                      <w:pStyle w:val="Textoindependiente"/>
-                      <w:spacing w:before="2"/>
-                      <w:jc w:val="center"/>
-                    </w:pPr>
-                    <w:r>
-                      <w:rPr>
-                        <w:color w:val="30849B"/>
-                      </w:rPr>
-                      <w:t>Jr.</w:t>
-                    </w:r>
-                    <w:r>
-                      <w:rPr>
-                        <w:color w:val="30849B"/>
-                        <w:spacing w:val="-3"/>
-                      </w:rPr>
-                      <w:t xml:space="preserve"> </w:t>
-                    </w:r>
-                    <w:r>
-                      <w:rPr>
-                        <w:color w:val="30849B"/>
-                      </w:rPr>
-                      <w:t>Las</w:t>
-                    </w:r>
-                    <w:r>
-                      <w:rPr>
-                        <w:color w:val="30849B"/>
-                        <w:spacing w:val="-2"/>
-                      </w:rPr>
-                      <w:t xml:space="preserve"> </w:t>
-                    </w:r>
-                    <w:r>
-                      <w:rPr>
-                        <w:color w:val="30849B"/>
-                      </w:rPr>
-                      <w:t>Malvinas</w:t>
-                    </w:r>
-                    <w:r>
-                      <w:rPr>
-                        <w:color w:val="30849B"/>
-                        <w:spacing w:val="-3"/>
-                      </w:rPr>
-                      <w:t xml:space="preserve"> </w:t>
-                    </w:r>
-                    <w:r>
-                      <w:rPr>
-                        <w:color w:val="30849B"/>
-                      </w:rPr>
-                      <w:t>S-N</w:t>
-                    </w:r>
-                    <w:r>
-                      <w:rPr>
-                        <w:color w:val="30849B"/>
-                        <w:spacing w:val="-2"/>
-                      </w:rPr>
-                      <w:t xml:space="preserve"> Mazamari</w:t>
-                    </w:r>
-                  </w:p>
-                </w:txbxContent>
-              </v:textbox>
-              <w10:wrap anchorx="page" anchory="page"/>
-            </v:shape>
-          </w:pict>
-        </mc:Fallback>
-      </mc:AlternateContent>
+      <w:t xml:space="preserve">GRUSELVA SAC</w:t>
     </w:r>
+  </w:p>
+  <w:p>
+    <w:pPr>
+      <w:spacing w:before="0" w:after="0" w:line="220" w:lineRule="exact"/>
+      <w:jc w:val="center"/>
+    </w:pPr>
     <w:r>
       <w:rPr>
-        <w:noProof/>
-        <w:sz w:val="20"/>
+        <w:rFonts w:ascii="Arial" w:hAnsi="Arial"/>
+        <w:color w:val="30849B"/>
+        <w:sz w:val="17"/>
       </w:rPr>
-      <mc:AlternateContent>
-        <mc:Choice Requires="wps">
-          <w:drawing>
-            <wp:anchor distT="0" distB="0" distL="0" distR="0" simplePos="0" relativeHeight="487523328" behindDoc="1" locked="0" layoutInCell="1" allowOverlap="1" wp14:anchorId="0F094776" wp14:editId="7207405F">
-              <wp:simplePos x="0" y="0"/>
-              <wp:positionH relativeFrom="page">
-                <wp:posOffset>2552826</wp:posOffset>
-              </wp:positionH>
-              <wp:positionV relativeFrom="page">
-                <wp:posOffset>10261421</wp:posOffset>
-              </wp:positionV>
-              <wp:extent cx="775335" cy="139700"/>
-              <wp:effectExtent l="0" t="0" r="0" b="0"/>
-              <wp:wrapNone/>
-              <wp:docPr id="2" name="Textbox 2"/>
-              <wp:cNvGraphicFramePr>
-                <a:graphicFrameLocks xmlns:a="http://schemas.openxmlformats.org/drawingml/2006/main"/>
-              </wp:cNvGraphicFramePr>
-              <a:graphic xmlns:a="http://schemas.openxmlformats.org/drawingml/2006/main">
-                <a:graphicData uri="http://schemas.microsoft.com/office/word/2010/wordprocessingShape">
-                  <wps:wsp>
-                    <wps:cNvSpPr txBox="1">
-                      <a:spLocks/>
-                    </wps:cNvSpPr>
-                    <wps:spPr>
-                      <a:xfrm>
-                        <a:off x="0" y="0"/>
-                        <a:ext cx="775335" cy="139700"/>
-                      </a:xfrm>
-                      <a:prstGeom prst="rect">
-                        <a:avLst/>
-                      </a:prstGeom>
-                    </wps:spPr>
-                    <wps:txbx>
-                      <w:txbxContent>
-                        <w:p>
-                          <w:pPr>
-                            <w:pStyle w:val="Textoindependiente"/>
-                            <w:spacing w:line="203" w:lineRule="exact"/>
-                            <w:ind w:left="20"/>
-                          </w:pPr>
-                          <w:r>
-                            <w:rPr>
-                              <w:color w:val="30849B"/>
-                            </w:rPr>
-                            <w:t>Telf.</w:t>
-                          </w:r>
-                          <w:r>
-                            <w:rPr>
-                              <w:color w:val="30849B"/>
-                              <w:spacing w:val="-3"/>
-                            </w:rPr>
-                            <w:t xml:space="preserve"> </w:t>
-                          </w:r>
-                          <w:r>
-                            <w:rPr>
-                              <w:color w:val="30849B"/>
-                              <w:spacing w:val="-2"/>
-                            </w:rPr>
-                            <w:t>933400858</w:t>
-                          </w:r>
-                        </w:p>
-                      </w:txbxContent>
-                    </wps:txbx>
-                    <wps:bodyPr wrap="square" lIns="0" tIns="0" rIns="0" bIns="0" rtlCol="0">
-                      <a:noAutofit/>
-                    </wps:bodyPr>
-                  </wps:wsp>
-                </a:graphicData>
-              </a:graphic>
-            </wp:anchor>
-          </w:drawing>
-        </mc:Choice>
-        <mc:Fallback>
-          <w:pict>
-            <v:shape w14:anchorId="0F094776" id="Textbox 2" o:spid="_x0000_s1027" type="#_x0000_t202" style="position:absolute;margin-left:201pt;margin-top:808pt;width:61.05pt;height:11pt;z-index:-15793152;visibility:visible;mso-wrap-style:square;mso-wrap-distance-left:0;mso-wrap-distance-top:0;mso-wrap-distance-right:0;mso-wrap-distance-bottom:0;mso-position-horizontal:absolute;mso-position-horizontal-relative:page;mso-position-vertical:absolute;mso-position-vertical-relative:page;v-text-anchor:top" o:gfxdata="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" filled="f" stroked="f">
-              <v:textbox inset="0,0,0,0">
-                <w:txbxContent>
-                  <w:p>
-                    <w:pPr>
-                      <w:pStyle w:val="Textoindependiente"/>
-                      <w:spacing w:line="203" w:lineRule="exact"/>
-                      <w:ind w:left="20"/>
-                    </w:pPr>
-                    <w:r>
-                      <w:rPr>
-                        <w:color w:val="30849B"/>
-                      </w:rPr>
-                      <w:t>Telf.</w:t>
-                    </w:r>
-                    <w:r>
-                      <w:rPr>
-                        <w:color w:val="30849B"/>
-                        <w:spacing w:val="-3"/>
-                      </w:rPr>
-                      <w:t xml:space="preserve"> </w:t>
-                    </w:r>
-                    <w:r>
-                      <w:rPr>
-                        <w:color w:val="30849B"/>
-                        <w:spacing w:val="-2"/>
-                      </w:rPr>
-                      <w:t>933400858</w:t>
-                    </w:r>
-                  </w:p>
-                </w:txbxContent>
-              </v:textbox>
-              <w10:wrap anchorx="page" anchory="page"/>
-            </v:shape>
-          </w:pict>
-        </mc:Fallback>
-      </mc:AlternateContent>
+      <w:t xml:space="preserve">Jr. Las Malvinas S-N Mazamari</w:t>
     </w:r>
+  </w:p>
+  <w:p>
+    <w:pPr>
+      <w:spacing w:before="0" w:after="0" w:line="220" w:lineRule="exact"/>
+      <w:jc w:val="center"/>
+    </w:pPr>
     <w:r>
       <w:rPr>
-        <w:noProof/>
-        <w:sz w:val="20"/>
+        <w:rFonts w:ascii="Arial" w:hAnsi="Arial"/>
+        <w:color w:val="30849B"/>
+        <w:sz w:val="17"/>
       </w:rPr>
-      <mc:AlternateContent>
-        <mc:Choice Requires="wps">
-          <w:drawing>
-            <wp:anchor distT="0" distB="0" distL="0" distR="0" simplePos="0" relativeHeight="487523840" behindDoc="1" locked="0" layoutInCell="1" allowOverlap="1" wp14:anchorId="1B3D79CB" wp14:editId="20762F33">
-              <wp:simplePos x="0" y="0"/>
-              <wp:positionH relativeFrom="page">
-                <wp:posOffset>3613530</wp:posOffset>
-              </wp:positionH>
-              <wp:positionV relativeFrom="page">
-                <wp:posOffset>10261421</wp:posOffset>
-              </wp:positionV>
-              <wp:extent cx="1143635" cy="139700"/>
-              <wp:effectExtent l="0" t="0" r="0" b="0"/>
-              <wp:wrapNone/>
-              <wp:docPr id="3" name="Textbox 3"/>
-              <wp:cNvGraphicFramePr>
-                <a:graphicFrameLocks xmlns:a="http://schemas.openxmlformats.org/drawingml/2006/main"/>
-              </wp:cNvGraphicFramePr>
-              <a:graphic xmlns:a="http://schemas.openxmlformats.org/drawingml/2006/main">
-                <a:graphicData uri="http://schemas.microsoft.com/office/word/2010/wordprocessingShape">
-                  <wps:wsp>
-                    <wps:cNvSpPr txBox="1">
-                      <a:spLocks/>
-                    </wps:cNvSpPr>
-                    <wps:spPr>
-                      <a:xfrm>
-                        <a:off x="0" y="0"/>
-                        <a:ext cx="1143635" cy="139700"/>
-                      </a:xfrm>
-                      <a:prstGeom prst="rect">
-                        <a:avLst/>
-                      </a:prstGeom>
-                    </wps:spPr>
-                    <wps:txbx>
-                      <w:txbxContent>
-                        <w:p>
-                          <w:pPr>
-                            <w:pStyle w:val="Textoindependiente"/>
-                            <w:spacing w:line="203" w:lineRule="exact"/>
-                            <w:ind w:left="20"/>
-                          </w:pPr>
-                          <w:hyperlink r:id="rId1">
-                            <w:r>
-                              <w:rPr>
-                                <w:color w:val="30849B"/>
-                                <w:spacing w:val="-2"/>
-                              </w:rPr>
-                              <w:t>gruselvasac@gmail.com</w:t>
-                            </w:r>
-                          </w:hyperlink>
-                        </w:p>
-                      </w:txbxContent>
-                    </wps:txbx>
-                    <wps:bodyPr wrap="square" lIns="0" tIns="0" rIns="0" bIns="0" rtlCol="0">
-                      <a:noAutofit/>
-                    </wps:bodyPr>
-                  </wps:wsp>
-                </a:graphicData>
-              </a:graphic>
-            </wp:anchor>
-          </w:drawing>
-        </mc:Choice>
-        <mc:Fallback>
-          <w:pict>
-            <v:shape w14:anchorId="1B3D79CB" id="Textbox 3" o:spid="_x0000_s1028" type="#_x0000_t202" style="position:absolute;margin-left:284.55pt;margin-top:808pt;width:90.05pt;height:11pt;z-index:-15792640;visibility:visible;mso-wrap-style:square;mso-wrap-distance-left:0;mso-wrap-distance-top:0;mso-wrap-distance-right:0;mso-wrap-distance-bottom:0;mso-position-horizontal:absolute;mso-position-horizontal-relative:page;mso-position-vertical:absolute;mso-position-vertical-relative:page;v-text-anchor:top" o:gfxdata="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" filled="f" stroked="f">
-              <v:textbox inset="0,0,0,0">
-                <w:txbxContent>
-                  <w:p>
-                    <w:pPr>
-                      <w:pStyle w:val="Textoindependiente"/>
-                      <w:spacing w:line="203" w:lineRule="exact"/>
-                      <w:ind w:left="20"/>
-                    </w:pPr>
-                    <w:hyperlink r:id="rId2">
-                      <w:r>
-                        <w:rPr>
-                          <w:color w:val="30849B"/>
-                          <w:spacing w:val="-2"/>
-                        </w:rPr>
-                        <w:t>gruselvasac@gmail.com</w:t>
-                      </w:r>
-                    </w:hyperlink>
-                  </w:p>
-                </w:txbxContent>
-              </v:textbox>
-              <w10:wrap anchorx="page" anchory="page"/>
-            </v:shape>
-          </w:pict>
-        </mc:Fallback>
-      </mc:AlternateContent>
+      <w:t xml:space="preserve">Telf. 933400858     </w:t>
     </w:r>
+    <w:hyperlink r:id="rId2">
+      <w:r>
+        <w:rPr>
+          <w:rFonts w:ascii="Arial" w:hAnsi="Arial"/>
+          <w:color w:val="30849B"/>
+          <w:sz w:val="17"/>
+        </w:rPr>
+        <w:t xml:space="preserve">gruselvasac@gmail.com</w:t>
+      </w:r>
+    </w:hyperlink>
   </w:p>
 </w:ftr>
 </file>
 
 <file path=word/footnotes.xml><?xml version="1.0" encoding="utf-8"?>
-<w:footnotes xmlns:wpc="http://schemas.microsoft.com/office/word/2010/wordprocessingCanvas" xmlns:cx="http://schemas.microsoft.com/office/drawing/2014/chartex" xmlns:cx1="http://schemas.microsoft.com/office/drawing/2015/9/8/chartex" xmlns:cx2="http://schemas.microsoft.com/office/drawing/2015/10/21/chartex" xmlns:cx3="http://schemas.microsoft.com/office/drawing/2016/5/9/chartex" xmlns:cx4="http://schemas.microsoft.com/office/drawing/2016/5/10/chartex" xmlns:cx5="http://schemas.microsoft.com/office/drawing/2016/5/11/chartex" xmlns:cx6="http://schemas.microsoft.com/office/drawing/2016/5/12/chartex" xmlns:cx7="http://schemas.microsoft.com/office/drawing/2016/5/13/chartex" xmlns:cx8="http://schemas.microsoft.com/office/drawing/2016/5/14/chartex" xmlns:mc="http://schemas.openxmlformats.org/markup-compatibility/2006" xmlns:aink="http://schemas.microsoft.com/office/drawing/2016/ink" xmlns:am3d="http://schemas.microsoft.com/office/drawing/2017/model3d" xmlns:o="urn:schemas-microsoft-com:office:office" xmlns:oel="http://schemas.microsoft.com/office/2019/extlst" xmlns:r="http://schemas.openxmlformats.org/officeDocument/2006/relationships" xmlns:m="http://schemas.openxmlformats.org/officeDocument/2006/math" xmlns:v="urn:schemas-microsoft-com:vml" xmlns:wp14="http://schemas.microsoft.com/office/word/2010/wordprocessingDrawing" xmlns:wp="http://schemas.openxmlformats.org/drawingml/2006/wordprocessingDrawing" xmlns:w10="urn:schemas-microsoft-com:office:word" xmlns:w="http://schemas.openxmlformats.org/wordprocessingml/2006/main" xmlns:w14="http://schemas.microsoft.com/office/word/2010/wordml" xmlns:w15="http://schemas.microsoft.com/office/word/2012/wordml" xmlns:w16cex="http://schemas.microsoft.com/office/word/2018/wordml/cex" xmlns:w16cid="http://schemas.microsoft.com/office/word/2016/wordml/cid" xmlns:w16="http://schemas.microsoft.com/office/word/2018/wordml" xmlns:w16du="http://schemas.microsoft.com/office/word/2023/wordml/word16du" xmlns:w16sdtdh="http://schemas.microsoft.com/office/word/2020/wordml/sdtdatahash" xmlns:w16sdtfl="http://schemas.microsoft.com/office/word/2024/wordml/sdtformatlock" xmlns:w16se="http://schemas.microsoft.com/office/word/2015/wordml/symex" xmlns:wpg="http://schemas.microsoft.com/office/word/2010/wordprocessingGroup" xmlns:wpi="http://schemas.microsoft.com/office/word/2010/wordprocessingInk" xmlns:wne="http://schemas.microsoft.com/office/word/2006/wordml" xmlns:wps="http://schemas.microsoft.com/office/word/2010/wordprocessingShape" mc:Ignorable="w14 w15 w16se w16cid w16 w16cex w16sdtdh w16sdtfl w16du wp14">
+<w:footnotes xmlns:wpc="http://schemas.microsoft.com/office/word/2010/wordprocessingCanvas" xmlns:cx="http://schemas.microsoft.com/office/drawing/2014/chartex" xmlns:cx1="http://schemas.microsoft.com/office/drawing/2015/9/8/chartex" xmlns:cx2="http://schemas.microsoft.com/office/drawing/2015/10/21/chartex" xmlns:cx3="http://schemas.microsoft.com/office/drawing/2016/5/9/chartex" xmlns:cx4="http://schemas.microsoft.com/office/drawing/2016/5/10/chartex" xmlns:cx5="http://schemas.microsoft.com/office/drawing/2016/5/11/chartex" xmlns:cx6="http://schemas.microsoft.com/office/drawing/2016/5/12/chartex" xmlns:cx7="http://schemas.microsoft.com/office/drawing/2016/5/13/chartex" xmlns:cx8="http://schemas.microsoft.com/office/drawing/2016/5/14/chartex" xmlns:mc="http://schemas.openxmlformats.org/markup-compatibility/2006" xmlns:aink="http://schemas.microsoft.com/office/drawing/2016/ink" xmlns:am3d="http://schemas.microsoft.com/office/drawing/2017/model3d" xmlns:o="urn:schemas-microsoft-com:office:office" xmlns:oel="http://schemas.microsoft.com/office/2019/extlst" xmlns:r="http://schemas.openxmlformats.org/officeDocument/2006/relationships" xmlns:m="http://schemas.openxmlformats.org/officeDocument/2006/math" xmlns:v="urn:schemas-microsoft-com:vml" xmlns:wp14="http://schemas.microsoft.com/office/word/2010/wordprocessingDrawing" xmlns:wp="http://schemas.openxmlformats.org/drawingml/2006/wordprocessingDrawing" xmlns:w10="urn:schemas-microsoft-com:office:word" xmlns:w="http://schemas.openxmlformats.org/wordprocessingml/2006/main" xmlns:w14="http://schemas.microsoft.com/office/word/2010/wordml" xmlns:w15="http://schemas.microsoft.com/office/word/2012/wordml" xmlns:w16cex="http://schemas.microsoft.com/office/word/2018/wordml/cex" xmlns:w16cid="http://schemas.microsoft.com/office/word/2016/wordml/cid" xmlns:w16="http://schemas.microsoft.com/office/word/2018/wordml" xmlns:w16du="http://schemas.microsoft.com/office/word/2023/wordml/word16du" xmlns:w16sdtdh="http://schemas.microsoft.com/office/word/2020/wordml/sdtdatahash" xmlns:w16se="http://schemas.microsoft.com/office/word/2015/wordml/symex" xmlns:wpg="http://schemas.microsoft.com/office/word/2010/wordprocessingGroup" xmlns:wpi="http://schemas.microsoft.com/office/word/2010/wordprocessingInk" xmlns:wne="http://schemas.microsoft.com/office/word/2006/wordml" xmlns:wps="http://schemas.microsoft.com/office/word/2010/wordprocessingShape" mc:Ignorable="w14 w15 w16se w16cid w16 w16cex w16sdtdh w16du wp14">
   <w:footnote w:type="separator" w:id="-1">
     <w:p>
       <w:r>
@@ -4192,7 +3754,7 @@
 </file>
 
 <file path=word/styles.xml><?xml version="1.0" encoding="utf-8"?>
-<w:styles xmlns:mc="http://schemas.openxmlformats.org/markup-compatibility/2006" xmlns:r="http://schemas.openxmlformats.org/officeDocument/2006/relationships" xmlns:w="http://schemas.openxmlformats.org/wordprocessingml/2006/main" xmlns:w14="http://schemas.microsoft.com/office/word/2010/wordml" xmlns:w15="http://schemas.microsoft.com/office/word/2012/wordml" xmlns:w16cex="http://schemas.microsoft.com/office/word/2018/wordml/cex" xmlns:w16cid="http://schemas.microsoft.com/office/word/2016/wordml/cid" xmlns:w16="http://schemas.microsoft.com/office/word/2018/wordml" xmlns:w16du="http://schemas.microsoft.com/office/word/2023/wordml/word16du" xmlns:w16sdtdh="http://schemas.microsoft.com/office/word/2020/wordml/sdtdatahash" xmlns:w16sdtfl="http://schemas.microsoft.com/office/word/2024/wordml/sdtformatlock" xmlns:w16se="http://schemas.microsoft.com/office/word/2015/wordml/symex" mc:Ignorable="w14 w15 w16se w16cid w16 w16cex w16sdtdh w16sdtfl w16du">
+<w:styles xmlns:mc="http://schemas.openxmlformats.org/markup-compatibility/2006" xmlns:r="http://schemas.openxmlformats.org/officeDocument/2006/relationships" xmlns:w="http://schemas.openxmlformats.org/wordprocessingml/2006/main" xmlns:w14="http://schemas.microsoft.com/office/word/2010/wordml" xmlns:w15="http://schemas.microsoft.com/office/word/2012/wordml" xmlns:w16cex="http://schemas.microsoft.com/office/word/2018/wordml/cex" xmlns:w16cid="http://schemas.microsoft.com/office/word/2016/wordml/cid" xmlns:w16="http://schemas.microsoft.com/office/word/2018/wordml" xmlns:w16du="http://schemas.microsoft.com/office/word/2023/wordml/word16du" xmlns:w16sdtdh="http://schemas.microsoft.com/office/word/2020/wordml/sdtdatahash" xmlns:w16se="http://schemas.microsoft.com/office/word/2015/wordml/symex" mc:Ignorable="w14 w15 w16se w16cid w16 w16cex w16sdtdh w16du">
   <w:docDefaults>
     <w:rPrDefault>
       <w:rPr>
@@ -4592,13 +4154,14 @@
     <w:name w:val="Normal"/>
     <w:qFormat/>
     <w:rPr>
-      <w:rFonts w:ascii="Arial MT" w:eastAsia="Arial MT" w:hAnsi="Arial MT" w:cs="Arial MT"/>
+      <w:rFonts w:ascii="Arial" w:eastAsia="Arial" w:hAnsi="Arial" w:cs="Arial"/>
       <w:lang w:val="es-ES"/>
     </w:rPr>
   </w:style>
   <w:style w:type="character" w:default="1" w:styleId="Fuentedeprrafopredeter">
     <w:name w:val="Default Paragraph Font"/>
     <w:uiPriority w:val="1"/>
+    <w:semiHidden/>
     <w:unhideWhenUsed/>
   </w:style>
   <w:style w:type="table" w:default="1" w:styleId="Tablanormal">

</xml_diff>